<commit_message>
chore: update APX-DRM-301 shells; ignore generated dirs
Add graphify-out/ and inputs/.shell_backup/ to .gitignore -
generated code-graph output and local shell backups.
</commit_message>
<xml_diff>
--- a/inputs/APX-DRM-301_TLF_Shells_Clean_v1.0.docx
+++ b/inputs/APX-DRM-301_TLF_Shells_Clean_v1.0.docx
@@ -685,77 +685,6 @@
           </w:tcPr>
           <w:p>
             <w:r>
-              <w:t>Table 14.2.2</w:t>
-            </w:r>
-          </w:p>
-        </w:tc>
-        <w:tc>
-          <w:tcPr>
-            <w:tcW w:w="6800" w:type="dxa"/>
-            <w:tcBorders>
-              <w:top w:val="single" w:sz="4" w:space="0" w:color="808080"/>
-              <w:left w:val="single" w:sz="4" w:space="0" w:color="808080"/>
-              <w:bottom w:val="single" w:sz="4" w:space="0" w:color="808080"/>
-              <w:right w:val="single" w:sz="4" w:space="0" w:color="808080"/>
-            </w:tcBorders>
-            <w:tcMar>
-              <w:top w:w="60" w:type="dxa"/>
-              <w:left w:w="100" w:type="dxa"/>
-              <w:bottom w:w="60" w:type="dxa"/>
-              <w:right w:w="100" w:type="dxa"/>
-            </w:tcMar>
-            <w:vAlign w:val="center"/>
-          </w:tcPr>
-          <w:p>
-            <w:r>
-              <w:t>EASI 75 / 90 / 100 / EASI ≤3 / ≤7 Through Week 140</w:t>
-            </w:r>
-          </w:p>
-        </w:tc>
-        <w:tc>
-          <w:tcPr>
-            <w:tcW w:w="1860" w:type="dxa"/>
-            <w:tcBorders>
-              <w:top w:val="single" w:sz="4" w:space="0" w:color="808080"/>
-              <w:left w:val="single" w:sz="4" w:space="0" w:color="808080"/>
-              <w:bottom w:val="single" w:sz="4" w:space="0" w:color="808080"/>
-              <w:right w:val="single" w:sz="4" w:space="0" w:color="808080"/>
-            </w:tcBorders>
-            <w:tcMar>
-              <w:top w:w="60" w:type="dxa"/>
-              <w:left w:w="100" w:type="dxa"/>
-              <w:bottom w:w="60" w:type="dxa"/>
-              <w:right w:w="100" w:type="dxa"/>
-            </w:tcMar>
-            <w:vAlign w:val="center"/>
-          </w:tcPr>
-          <w:p>
-            <w:r>
-              <w:t>ITT (OC)</w:t>
-            </w:r>
-          </w:p>
-        </w:tc>
-      </w:tr>
-      <w:tr>
-        <w:tc>
-          <w:tcPr>
-            <w:tcW w:w="1700" w:type="dxa"/>
-            <w:tcBorders>
-              <w:top w:val="single" w:sz="4" w:space="0" w:color="808080"/>
-              <w:left w:val="single" w:sz="4" w:space="0" w:color="808080"/>
-              <w:bottom w:val="single" w:sz="4" w:space="0" w:color="808080"/>
-              <w:right w:val="single" w:sz="4" w:space="0" w:color="808080"/>
-            </w:tcBorders>
-            <w:tcMar>
-              <w:top w:w="60" w:type="dxa"/>
-              <w:left w:w="100" w:type="dxa"/>
-              <w:bottom w:w="60" w:type="dxa"/>
-              <w:right w:w="100" w:type="dxa"/>
-            </w:tcMar>
-            <w:vAlign w:val="center"/>
-          </w:tcPr>
-          <w:p>
-            <w:r>
               <w:t>Table 14.3.1</w:t>
             </w:r>
           </w:p>
@@ -17770,3580 +17699,6 @@
           <w:szCs w:val="14"/>
         </w:rPr>
         <w:t>Source: ADEFF (PARAMCD='EASI75').</w:t>
-      </w:r>
-    </w:p>
-    <w:p>
-      <w:r>
-        <w:br w:type="page"/>
-      </w:r>
-    </w:p>
-    <w:p>
-      <w:pPr>
-        <w:spacing w:before="240" w:after="60"/>
-        <w:jc w:val="center"/>
-      </w:pPr>
-      <w:r>
-        <w:rPr>
-          <w:b/>
-          <w:bCs/>
-          <w:sz w:val="22"/>
-          <w:szCs w:val="22"/>
-        </w:rPr>
-        <w:lastRenderedPageBreak/>
-        <w:t>Table 14.2.2</w:t>
-      </w:r>
-    </w:p>
-    <w:p>
-      <w:pPr>
-        <w:spacing w:after="60"/>
-        <w:jc w:val="center"/>
-      </w:pPr>
-      <w:r>
-        <w:rPr>
-          <w:b/>
-          <w:bCs/>
-          <w:sz w:val="22"/>
-          <w:szCs w:val="22"/>
-        </w:rPr>
-        <w:t>Proportion of Subjects Achieving EASI Response Endpoints Through Week 140</w:t>
-      </w:r>
-    </w:p>
-    <w:p>
-      <w:pPr>
-        <w:spacing w:after="200"/>
-        <w:jc w:val="center"/>
-      </w:pPr>
-      <w:r>
-        <w:t>Intent-to-Treat Population, Observed Cases Without Imputation (</w:t>
-      </w:r>
-      <w:r>
-        <w:rPr>
-          <w:color w:val="000000"/>
-        </w:rPr>
-        <w:t>ADSL.ITTFL='Y'</w:t>
-      </w:r>
-      <w:r>
-        <w:t>)</w:t>
-      </w:r>
-    </w:p>
-    <w:tbl>
-      <w:tblPr>
-        <w:tblW w:w="9200" w:type="dxa"/>
-        <w:tblBorders>
-          <w:top w:val="single" w:sz="4" w:space="0" w:color="auto"/>
-          <w:left w:val="single" w:sz="4" w:space="0" w:color="auto"/>
-          <w:bottom w:val="single" w:sz="4" w:space="0" w:color="auto"/>
-          <w:right w:val="single" w:sz="4" w:space="0" w:color="auto"/>
-          <w:insideH w:val="single" w:sz="4" w:space="0" w:color="auto"/>
-          <w:insideV w:val="single" w:sz="4" w:space="0" w:color="auto"/>
-        </w:tblBorders>
-        <w:tblCellMar>
-          <w:left w:w="10" w:type="dxa"/>
-          <w:right w:w="10" w:type="dxa"/>
-        </w:tblCellMar>
-        <w:tblLook w:val="0000" w:firstRow="0" w:lastRow="0" w:firstColumn="0" w:lastColumn="0" w:noHBand="0" w:noVBand="0"/>
-      </w:tblPr>
-      <w:tblGrid>
-        <w:gridCol w:w="4279"/>
-        <w:gridCol w:w="779"/>
-        <w:gridCol w:w="1471"/>
-        <w:gridCol w:w="1471"/>
-        <w:gridCol w:w="1200"/>
-      </w:tblGrid>
-      <w:tr>
-        <w:trPr>
-          <w:tblHeader/>
-        </w:trPr>
-        <w:tc>
-          <w:tcPr>
-            <w:tcW w:w="3000" w:type="dxa"/>
-            <w:tcBorders>
-              <w:top w:val="single" w:sz="4" w:space="0" w:color="808080"/>
-              <w:left w:val="single" w:sz="4" w:space="0" w:color="808080"/>
-              <w:bottom w:val="single" w:sz="4" w:space="0" w:color="808080"/>
-              <w:right w:val="single" w:sz="4" w:space="0" w:color="808080"/>
-            </w:tcBorders>
-            <w:shd w:val="clear" w:color="auto" w:fill="D9E2F3"/>
-            <w:tcMar>
-              <w:top w:w="60" w:type="dxa"/>
-              <w:left w:w="100" w:type="dxa"/>
-              <w:bottom w:w="60" w:type="dxa"/>
-              <w:right w:w="100" w:type="dxa"/>
-            </w:tcMar>
-            <w:vAlign w:val="center"/>
-          </w:tcPr>
-          <w:p>
-            <w:r>
-              <w:rPr>
-                <w:b/>
-                <w:bCs/>
-              </w:rPr>
-              <w:t>Endpoint</w:t>
-            </w:r>
-          </w:p>
-        </w:tc>
-        <w:tc>
-          <w:tcPr>
-            <w:tcW w:w="1100" w:type="dxa"/>
-            <w:tcBorders>
-              <w:top w:val="single" w:sz="4" w:space="0" w:color="808080"/>
-              <w:left w:val="single" w:sz="4" w:space="0" w:color="808080"/>
-              <w:bottom w:val="single" w:sz="4" w:space="0" w:color="808080"/>
-              <w:right w:val="single" w:sz="4" w:space="0" w:color="808080"/>
-            </w:tcBorders>
-            <w:shd w:val="clear" w:color="auto" w:fill="D9E2F3"/>
-            <w:tcMar>
-              <w:top w:w="60" w:type="dxa"/>
-              <w:left w:w="100" w:type="dxa"/>
-              <w:bottom w:w="60" w:type="dxa"/>
-              <w:right w:w="100" w:type="dxa"/>
-            </w:tcMar>
-            <w:vAlign w:val="center"/>
-          </w:tcPr>
-          <w:p>
-            <w:pPr>
-              <w:jc w:val="center"/>
-            </w:pPr>
-            <w:r>
-              <w:rPr>
-                <w:b/>
-                <w:bCs/>
-              </w:rPr>
-              <w:t>Visit</w:t>
-            </w:r>
-          </w:p>
-        </w:tc>
-        <w:tc>
-          <w:tcPr>
-            <w:tcW w:w="1700" w:type="dxa"/>
-            <w:tcBorders>
-              <w:top w:val="single" w:sz="4" w:space="0" w:color="808080"/>
-              <w:left w:val="single" w:sz="4" w:space="0" w:color="808080"/>
-              <w:bottom w:val="single" w:sz="4" w:space="0" w:color="808080"/>
-              <w:right w:val="single" w:sz="4" w:space="0" w:color="808080"/>
-            </w:tcBorders>
-            <w:shd w:val="clear" w:color="auto" w:fill="D9E2F3"/>
-            <w:tcMar>
-              <w:top w:w="60" w:type="dxa"/>
-              <w:left w:w="100" w:type="dxa"/>
-              <w:bottom w:w="60" w:type="dxa"/>
-              <w:right w:w="100" w:type="dxa"/>
-            </w:tcMar>
-            <w:vAlign w:val="center"/>
-          </w:tcPr>
-          <w:p>
-            <w:pPr>
-              <w:jc w:val="center"/>
-            </w:pPr>
-            <w:r>
-              <w:rPr>
-                <w:b/>
-                <w:bCs/>
-              </w:rPr>
-              <w:t>UPADALIMIB 15 mg (N=200) n/N' (%) [95% CI]</w:t>
-            </w:r>
-          </w:p>
-        </w:tc>
-        <w:tc>
-          <w:tcPr>
-            <w:tcW w:w="1700" w:type="dxa"/>
-            <w:tcBorders>
-              <w:top w:val="single" w:sz="4" w:space="0" w:color="808080"/>
-              <w:left w:val="single" w:sz="4" w:space="0" w:color="808080"/>
-              <w:bottom w:val="single" w:sz="4" w:space="0" w:color="808080"/>
-              <w:right w:val="single" w:sz="4" w:space="0" w:color="808080"/>
-            </w:tcBorders>
-            <w:shd w:val="clear" w:color="auto" w:fill="D9E2F3"/>
-            <w:tcMar>
-              <w:top w:w="60" w:type="dxa"/>
-              <w:left w:w="100" w:type="dxa"/>
-              <w:bottom w:w="60" w:type="dxa"/>
-              <w:right w:w="100" w:type="dxa"/>
-            </w:tcMar>
-            <w:vAlign w:val="center"/>
-          </w:tcPr>
-          <w:p>
-            <w:pPr>
-              <w:jc w:val="center"/>
-            </w:pPr>
-            <w:r>
-              <w:rPr>
-                <w:b/>
-                <w:bCs/>
-              </w:rPr>
-              <w:t>UPADALIMIB 30 mg (N=200) n/N' (%) [95% CI]</w:t>
-            </w:r>
-          </w:p>
-        </w:tc>
-        <w:tc>
-          <w:tcPr>
-            <w:tcW w:w="1700" w:type="dxa"/>
-            <w:tcBorders>
-              <w:top w:val="single" w:sz="4" w:space="0" w:color="808080"/>
-              <w:left w:val="single" w:sz="4" w:space="0" w:color="808080"/>
-              <w:bottom w:val="single" w:sz="4" w:space="0" w:color="808080"/>
-              <w:right w:val="single" w:sz="4" w:space="0" w:color="808080"/>
-            </w:tcBorders>
-            <w:shd w:val="clear" w:color="auto" w:fill="D9E2F3"/>
-            <w:tcMar>
-              <w:top w:w="60" w:type="dxa"/>
-              <w:left w:w="100" w:type="dxa"/>
-              <w:bottom w:w="60" w:type="dxa"/>
-              <w:right w:w="100" w:type="dxa"/>
-            </w:tcMar>
-            <w:vAlign w:val="center"/>
-          </w:tcPr>
-          <w:p>
-            <w:pPr>
-              <w:jc w:val="center"/>
-            </w:pPr>
-            <w:r>
-              <w:rPr>
-                <w:b/>
-                <w:bCs/>
-              </w:rPr>
-              <w:t>Placebo (N=200) n/N' (%) [95% CI]</w:t>
-            </w:r>
-          </w:p>
-        </w:tc>
-      </w:tr>
-      <w:tr>
-        <w:trPr>
-          <w:gridAfter w:val="4"/>
-          <w:wAfter w:w="6200" w:type="dxa"/>
-        </w:trPr>
-        <w:tc>
-          <w:tcPr>
-            <w:tcW w:w="9200" w:type="dxa"/>
-            <w:tcBorders>
-              <w:top w:val="single" w:sz="4" w:space="0" w:color="808080"/>
-              <w:left w:val="single" w:sz="4" w:space="0" w:color="808080"/>
-              <w:bottom w:val="single" w:sz="4" w:space="0" w:color="808080"/>
-              <w:right w:val="single" w:sz="4" w:space="0" w:color="808080"/>
-            </w:tcBorders>
-            <w:shd w:val="clear" w:color="auto" w:fill="D9E2F3"/>
-            <w:tcMar>
-              <w:top w:w="60" w:type="dxa"/>
-              <w:left w:w="100" w:type="dxa"/>
-              <w:bottom w:w="60" w:type="dxa"/>
-              <w:right w:w="100" w:type="dxa"/>
-            </w:tcMar>
-            <w:vAlign w:val="center"/>
-          </w:tcPr>
-          <w:p>
-            <w:r>
-              <w:t xml:space="preserve">EASI 75 (≥ 75% improvement from baseline in EASI)  </w:t>
-            </w:r>
-          </w:p>
-        </w:tc>
-      </w:tr>
-      <w:tr>
-        <w:tc>
-          <w:tcPr>
-            <w:tcW w:w="3000" w:type="dxa"/>
-            <w:tcBorders>
-              <w:top w:val="single" w:sz="4" w:space="0" w:color="808080"/>
-              <w:left w:val="single" w:sz="4" w:space="0" w:color="808080"/>
-              <w:bottom w:val="single" w:sz="4" w:space="0" w:color="808080"/>
-              <w:right w:val="single" w:sz="4" w:space="0" w:color="808080"/>
-            </w:tcBorders>
-            <w:tcMar>
-              <w:top w:w="60" w:type="dxa"/>
-              <w:left w:w="100" w:type="dxa"/>
-              <w:bottom w:w="60" w:type="dxa"/>
-              <w:right w:w="100" w:type="dxa"/>
-            </w:tcMar>
-            <w:vAlign w:val="center"/>
-          </w:tcPr>
-          <w:p>
-            <w:r>
-              <w:t>EASI 75 (≥ 75% improvement from baseline in EASI)</w:t>
-            </w:r>
-          </w:p>
-        </w:tc>
-        <w:tc>
-          <w:tcPr>
-            <w:tcW w:w="1100" w:type="dxa"/>
-            <w:tcBorders>
-              <w:top w:val="single" w:sz="4" w:space="0" w:color="808080"/>
-              <w:left w:val="single" w:sz="4" w:space="0" w:color="808080"/>
-              <w:bottom w:val="single" w:sz="4" w:space="0" w:color="808080"/>
-              <w:right w:val="single" w:sz="4" w:space="0" w:color="808080"/>
-            </w:tcBorders>
-            <w:tcMar>
-              <w:top w:w="60" w:type="dxa"/>
-              <w:left w:w="100" w:type="dxa"/>
-              <w:bottom w:w="60" w:type="dxa"/>
-              <w:right w:w="100" w:type="dxa"/>
-            </w:tcMar>
-            <w:vAlign w:val="center"/>
-          </w:tcPr>
-          <w:p>
-            <w:pPr>
-              <w:jc w:val="center"/>
-            </w:pPr>
-            <w:r>
-              <w:t>Wk 4</w:t>
-            </w:r>
-          </w:p>
-        </w:tc>
-        <w:tc>
-          <w:tcPr>
-            <w:tcW w:w="1700" w:type="dxa"/>
-            <w:tcBorders>
-              <w:top w:val="single" w:sz="4" w:space="0" w:color="808080"/>
-              <w:left w:val="single" w:sz="4" w:space="0" w:color="808080"/>
-              <w:bottom w:val="single" w:sz="4" w:space="0" w:color="808080"/>
-              <w:right w:val="single" w:sz="4" w:space="0" w:color="808080"/>
-            </w:tcBorders>
-            <w:tcMar>
-              <w:top w:w="60" w:type="dxa"/>
-              <w:left w:w="100" w:type="dxa"/>
-              <w:bottom w:w="60" w:type="dxa"/>
-              <w:right w:w="100" w:type="dxa"/>
-            </w:tcMar>
-            <w:vAlign w:val="center"/>
-          </w:tcPr>
-          <w:p>
-            <w:pPr>
-              <w:jc w:val="center"/>
-            </w:pPr>
-            <w:r>
-              <w:t>xxx/xxx (xx.x) [xx.x, xx.x]</w:t>
-            </w:r>
-          </w:p>
-        </w:tc>
-        <w:tc>
-          <w:tcPr>
-            <w:tcW w:w="1700" w:type="dxa"/>
-            <w:tcBorders>
-              <w:top w:val="single" w:sz="4" w:space="0" w:color="808080"/>
-              <w:left w:val="single" w:sz="4" w:space="0" w:color="808080"/>
-              <w:bottom w:val="single" w:sz="4" w:space="0" w:color="808080"/>
-              <w:right w:val="single" w:sz="4" w:space="0" w:color="808080"/>
-            </w:tcBorders>
-            <w:tcMar>
-              <w:top w:w="60" w:type="dxa"/>
-              <w:left w:w="100" w:type="dxa"/>
-              <w:bottom w:w="60" w:type="dxa"/>
-              <w:right w:w="100" w:type="dxa"/>
-            </w:tcMar>
-            <w:vAlign w:val="center"/>
-          </w:tcPr>
-          <w:p>
-            <w:pPr>
-              <w:jc w:val="center"/>
-            </w:pPr>
-            <w:r>
-              <w:t>xxx/xxx (xx.x) [xx.x, xx.x]</w:t>
-            </w:r>
-          </w:p>
-        </w:tc>
-        <w:tc>
-          <w:tcPr>
-            <w:tcW w:w="1700" w:type="dxa"/>
-            <w:tcBorders>
-              <w:top w:val="single" w:sz="4" w:space="0" w:color="808080"/>
-              <w:left w:val="single" w:sz="4" w:space="0" w:color="808080"/>
-              <w:bottom w:val="single" w:sz="4" w:space="0" w:color="808080"/>
-              <w:right w:val="single" w:sz="4" w:space="0" w:color="808080"/>
-            </w:tcBorders>
-            <w:tcMar>
-              <w:top w:w="60" w:type="dxa"/>
-              <w:left w:w="100" w:type="dxa"/>
-              <w:bottom w:w="60" w:type="dxa"/>
-              <w:right w:w="100" w:type="dxa"/>
-            </w:tcMar>
-            <w:vAlign w:val="center"/>
-          </w:tcPr>
-          <w:p>
-            <w:pPr>
-              <w:jc w:val="center"/>
-            </w:pPr>
-            <w:r>
-              <w:t>xxx/xxx (xx.x) [xx.x, xx.x]</w:t>
-            </w:r>
-          </w:p>
-        </w:tc>
-      </w:tr>
-      <w:tr>
-        <w:tc>
-          <w:tcPr>
-            <w:tcW w:w="3000" w:type="dxa"/>
-            <w:tcBorders>
-              <w:top w:val="single" w:sz="4" w:space="0" w:color="808080"/>
-              <w:left w:val="single" w:sz="4" w:space="0" w:color="808080"/>
-              <w:bottom w:val="single" w:sz="4" w:space="0" w:color="808080"/>
-              <w:right w:val="single" w:sz="4" w:space="0" w:color="808080"/>
-            </w:tcBorders>
-            <w:tcMar>
-              <w:top w:w="60" w:type="dxa"/>
-              <w:left w:w="100" w:type="dxa"/>
-              <w:bottom w:w="60" w:type="dxa"/>
-              <w:right w:w="100" w:type="dxa"/>
-            </w:tcMar>
-            <w:vAlign w:val="center"/>
-          </w:tcPr>
-          <w:p/>
-        </w:tc>
-        <w:tc>
-          <w:tcPr>
-            <w:tcW w:w="1100" w:type="dxa"/>
-            <w:tcBorders>
-              <w:top w:val="single" w:sz="4" w:space="0" w:color="808080"/>
-              <w:left w:val="single" w:sz="4" w:space="0" w:color="808080"/>
-              <w:bottom w:val="single" w:sz="4" w:space="0" w:color="808080"/>
-              <w:right w:val="single" w:sz="4" w:space="0" w:color="808080"/>
-            </w:tcBorders>
-            <w:tcMar>
-              <w:top w:w="60" w:type="dxa"/>
-              <w:left w:w="100" w:type="dxa"/>
-              <w:bottom w:w="60" w:type="dxa"/>
-              <w:right w:w="100" w:type="dxa"/>
-            </w:tcMar>
-            <w:vAlign w:val="center"/>
-          </w:tcPr>
-          <w:p>
-            <w:pPr>
-              <w:jc w:val="center"/>
-            </w:pPr>
-            <w:r>
-              <w:t>Wk 16</w:t>
-            </w:r>
-          </w:p>
-        </w:tc>
-        <w:tc>
-          <w:tcPr>
-            <w:tcW w:w="1700" w:type="dxa"/>
-            <w:tcBorders>
-              <w:top w:val="single" w:sz="4" w:space="0" w:color="808080"/>
-              <w:left w:val="single" w:sz="4" w:space="0" w:color="808080"/>
-              <w:bottom w:val="single" w:sz="4" w:space="0" w:color="808080"/>
-              <w:right w:val="single" w:sz="4" w:space="0" w:color="808080"/>
-            </w:tcBorders>
-            <w:tcMar>
-              <w:top w:w="60" w:type="dxa"/>
-              <w:left w:w="100" w:type="dxa"/>
-              <w:bottom w:w="60" w:type="dxa"/>
-              <w:right w:w="100" w:type="dxa"/>
-            </w:tcMar>
-            <w:vAlign w:val="center"/>
-          </w:tcPr>
-          <w:p>
-            <w:pPr>
-              <w:jc w:val="center"/>
-            </w:pPr>
-            <w:r>
-              <w:t>xxx/xxx (xx.x) [xx.x, xx.x]</w:t>
-            </w:r>
-          </w:p>
-        </w:tc>
-        <w:tc>
-          <w:tcPr>
-            <w:tcW w:w="1700" w:type="dxa"/>
-            <w:tcBorders>
-              <w:top w:val="single" w:sz="4" w:space="0" w:color="808080"/>
-              <w:left w:val="single" w:sz="4" w:space="0" w:color="808080"/>
-              <w:bottom w:val="single" w:sz="4" w:space="0" w:color="808080"/>
-              <w:right w:val="single" w:sz="4" w:space="0" w:color="808080"/>
-            </w:tcBorders>
-            <w:tcMar>
-              <w:top w:w="60" w:type="dxa"/>
-              <w:left w:w="100" w:type="dxa"/>
-              <w:bottom w:w="60" w:type="dxa"/>
-              <w:right w:w="100" w:type="dxa"/>
-            </w:tcMar>
-            <w:vAlign w:val="center"/>
-          </w:tcPr>
-          <w:p>
-            <w:pPr>
-              <w:jc w:val="center"/>
-            </w:pPr>
-            <w:r>
-              <w:t>xxx/xxx (xx.x) [xx.x, xx.x]</w:t>
-            </w:r>
-          </w:p>
-        </w:tc>
-        <w:tc>
-          <w:tcPr>
-            <w:tcW w:w="1700" w:type="dxa"/>
-            <w:tcBorders>
-              <w:top w:val="single" w:sz="4" w:space="0" w:color="808080"/>
-              <w:left w:val="single" w:sz="4" w:space="0" w:color="808080"/>
-              <w:bottom w:val="single" w:sz="4" w:space="0" w:color="808080"/>
-              <w:right w:val="single" w:sz="4" w:space="0" w:color="808080"/>
-            </w:tcBorders>
-            <w:tcMar>
-              <w:top w:w="60" w:type="dxa"/>
-              <w:left w:w="100" w:type="dxa"/>
-              <w:bottom w:w="60" w:type="dxa"/>
-              <w:right w:w="100" w:type="dxa"/>
-            </w:tcMar>
-            <w:vAlign w:val="center"/>
-          </w:tcPr>
-          <w:p>
-            <w:pPr>
-              <w:jc w:val="center"/>
-            </w:pPr>
-            <w:r>
-              <w:t>xxx/xxx (xx.x) [xx.x, xx.x]</w:t>
-            </w:r>
-          </w:p>
-        </w:tc>
-      </w:tr>
-      <w:tr>
-        <w:tc>
-          <w:tcPr>
-            <w:tcW w:w="3000" w:type="dxa"/>
-            <w:tcBorders>
-              <w:top w:val="single" w:sz="4" w:space="0" w:color="808080"/>
-              <w:left w:val="single" w:sz="4" w:space="0" w:color="808080"/>
-              <w:bottom w:val="single" w:sz="4" w:space="0" w:color="808080"/>
-              <w:right w:val="single" w:sz="4" w:space="0" w:color="808080"/>
-            </w:tcBorders>
-            <w:tcMar>
-              <w:top w:w="60" w:type="dxa"/>
-              <w:left w:w="100" w:type="dxa"/>
-              <w:bottom w:w="60" w:type="dxa"/>
-              <w:right w:w="100" w:type="dxa"/>
-            </w:tcMar>
-            <w:vAlign w:val="center"/>
-          </w:tcPr>
-          <w:p/>
-        </w:tc>
-        <w:tc>
-          <w:tcPr>
-            <w:tcW w:w="1100" w:type="dxa"/>
-            <w:tcBorders>
-              <w:top w:val="single" w:sz="4" w:space="0" w:color="808080"/>
-              <w:left w:val="single" w:sz="4" w:space="0" w:color="808080"/>
-              <w:bottom w:val="single" w:sz="4" w:space="0" w:color="808080"/>
-              <w:right w:val="single" w:sz="4" w:space="0" w:color="808080"/>
-            </w:tcBorders>
-            <w:tcMar>
-              <w:top w:w="60" w:type="dxa"/>
-              <w:left w:w="100" w:type="dxa"/>
-              <w:bottom w:w="60" w:type="dxa"/>
-              <w:right w:w="100" w:type="dxa"/>
-            </w:tcMar>
-            <w:vAlign w:val="center"/>
-          </w:tcPr>
-          <w:p>
-            <w:pPr>
-              <w:jc w:val="center"/>
-            </w:pPr>
-            <w:r>
-              <w:t>Wk 52</w:t>
-            </w:r>
-          </w:p>
-        </w:tc>
-        <w:tc>
-          <w:tcPr>
-            <w:tcW w:w="1700" w:type="dxa"/>
-            <w:tcBorders>
-              <w:top w:val="single" w:sz="4" w:space="0" w:color="808080"/>
-              <w:left w:val="single" w:sz="4" w:space="0" w:color="808080"/>
-              <w:bottom w:val="single" w:sz="4" w:space="0" w:color="808080"/>
-              <w:right w:val="single" w:sz="4" w:space="0" w:color="808080"/>
-            </w:tcBorders>
-            <w:tcMar>
-              <w:top w:w="60" w:type="dxa"/>
-              <w:left w:w="100" w:type="dxa"/>
-              <w:bottom w:w="60" w:type="dxa"/>
-              <w:right w:w="100" w:type="dxa"/>
-            </w:tcMar>
-            <w:vAlign w:val="center"/>
-          </w:tcPr>
-          <w:p>
-            <w:pPr>
-              <w:jc w:val="center"/>
-            </w:pPr>
-            <w:r>
-              <w:t>xxx/xxx (xx.x) [xx.x, xx.x]</w:t>
-            </w:r>
-          </w:p>
-        </w:tc>
-        <w:tc>
-          <w:tcPr>
-            <w:tcW w:w="1700" w:type="dxa"/>
-            <w:tcBorders>
-              <w:top w:val="single" w:sz="4" w:space="0" w:color="808080"/>
-              <w:left w:val="single" w:sz="4" w:space="0" w:color="808080"/>
-              <w:bottom w:val="single" w:sz="4" w:space="0" w:color="808080"/>
-              <w:right w:val="single" w:sz="4" w:space="0" w:color="808080"/>
-            </w:tcBorders>
-            <w:tcMar>
-              <w:top w:w="60" w:type="dxa"/>
-              <w:left w:w="100" w:type="dxa"/>
-              <w:bottom w:w="60" w:type="dxa"/>
-              <w:right w:w="100" w:type="dxa"/>
-            </w:tcMar>
-            <w:vAlign w:val="center"/>
-          </w:tcPr>
-          <w:p>
-            <w:pPr>
-              <w:jc w:val="center"/>
-            </w:pPr>
-            <w:r>
-              <w:t>xxx/xxx (xx.x) [xx.x, xx.x]</w:t>
-            </w:r>
-          </w:p>
-        </w:tc>
-        <w:tc>
-          <w:tcPr>
-            <w:tcW w:w="1700" w:type="dxa"/>
-            <w:tcBorders>
-              <w:top w:val="single" w:sz="4" w:space="0" w:color="808080"/>
-              <w:left w:val="single" w:sz="4" w:space="0" w:color="808080"/>
-              <w:bottom w:val="single" w:sz="4" w:space="0" w:color="808080"/>
-              <w:right w:val="single" w:sz="4" w:space="0" w:color="808080"/>
-            </w:tcBorders>
-            <w:tcMar>
-              <w:top w:w="60" w:type="dxa"/>
-              <w:left w:w="100" w:type="dxa"/>
-              <w:bottom w:w="60" w:type="dxa"/>
-              <w:right w:w="100" w:type="dxa"/>
-            </w:tcMar>
-            <w:vAlign w:val="center"/>
-          </w:tcPr>
-          <w:p>
-            <w:pPr>
-              <w:jc w:val="center"/>
-            </w:pPr>
-            <w:r>
-              <w:t>xxx/xxx (xx.x) [xx.x, xx.x]</w:t>
-            </w:r>
-          </w:p>
-        </w:tc>
-      </w:tr>
-      <w:tr>
-        <w:tc>
-          <w:tcPr>
-            <w:tcW w:w="3000" w:type="dxa"/>
-            <w:tcBorders>
-              <w:top w:val="single" w:sz="4" w:space="0" w:color="808080"/>
-              <w:left w:val="single" w:sz="4" w:space="0" w:color="808080"/>
-              <w:bottom w:val="single" w:sz="4" w:space="0" w:color="808080"/>
-              <w:right w:val="single" w:sz="4" w:space="0" w:color="808080"/>
-            </w:tcBorders>
-            <w:tcMar>
-              <w:top w:w="60" w:type="dxa"/>
-              <w:left w:w="100" w:type="dxa"/>
-              <w:bottom w:w="60" w:type="dxa"/>
-              <w:right w:w="100" w:type="dxa"/>
-            </w:tcMar>
-            <w:vAlign w:val="center"/>
-          </w:tcPr>
-          <w:p/>
-        </w:tc>
-        <w:tc>
-          <w:tcPr>
-            <w:tcW w:w="1100" w:type="dxa"/>
-            <w:tcBorders>
-              <w:top w:val="single" w:sz="4" w:space="0" w:color="808080"/>
-              <w:left w:val="single" w:sz="4" w:space="0" w:color="808080"/>
-              <w:bottom w:val="single" w:sz="4" w:space="0" w:color="808080"/>
-              <w:right w:val="single" w:sz="4" w:space="0" w:color="808080"/>
-            </w:tcBorders>
-            <w:tcMar>
-              <w:top w:w="60" w:type="dxa"/>
-              <w:left w:w="100" w:type="dxa"/>
-              <w:bottom w:w="60" w:type="dxa"/>
-              <w:right w:w="100" w:type="dxa"/>
-            </w:tcMar>
-            <w:vAlign w:val="center"/>
-          </w:tcPr>
-          <w:p>
-            <w:pPr>
-              <w:jc w:val="center"/>
-            </w:pPr>
-            <w:r>
-              <w:t>Wk 104</w:t>
-            </w:r>
-          </w:p>
-        </w:tc>
-        <w:tc>
-          <w:tcPr>
-            <w:tcW w:w="1700" w:type="dxa"/>
-            <w:tcBorders>
-              <w:top w:val="single" w:sz="4" w:space="0" w:color="808080"/>
-              <w:left w:val="single" w:sz="4" w:space="0" w:color="808080"/>
-              <w:bottom w:val="single" w:sz="4" w:space="0" w:color="808080"/>
-              <w:right w:val="single" w:sz="4" w:space="0" w:color="808080"/>
-            </w:tcBorders>
-            <w:tcMar>
-              <w:top w:w="60" w:type="dxa"/>
-              <w:left w:w="100" w:type="dxa"/>
-              <w:bottom w:w="60" w:type="dxa"/>
-              <w:right w:w="100" w:type="dxa"/>
-            </w:tcMar>
-            <w:vAlign w:val="center"/>
-          </w:tcPr>
-          <w:p>
-            <w:pPr>
-              <w:jc w:val="center"/>
-            </w:pPr>
-            <w:r>
-              <w:t>xxx/xxx (xx.x) [xx.x, xx.x]</w:t>
-            </w:r>
-          </w:p>
-        </w:tc>
-        <w:tc>
-          <w:tcPr>
-            <w:tcW w:w="1700" w:type="dxa"/>
-            <w:tcBorders>
-              <w:top w:val="single" w:sz="4" w:space="0" w:color="808080"/>
-              <w:left w:val="single" w:sz="4" w:space="0" w:color="808080"/>
-              <w:bottom w:val="single" w:sz="4" w:space="0" w:color="808080"/>
-              <w:right w:val="single" w:sz="4" w:space="0" w:color="808080"/>
-            </w:tcBorders>
-            <w:tcMar>
-              <w:top w:w="60" w:type="dxa"/>
-              <w:left w:w="100" w:type="dxa"/>
-              <w:bottom w:w="60" w:type="dxa"/>
-              <w:right w:w="100" w:type="dxa"/>
-            </w:tcMar>
-            <w:vAlign w:val="center"/>
-          </w:tcPr>
-          <w:p>
-            <w:pPr>
-              <w:jc w:val="center"/>
-            </w:pPr>
-            <w:r>
-              <w:t>xxx/xxx (xx.x) [xx.x, xx.x]</w:t>
-            </w:r>
-          </w:p>
-        </w:tc>
-        <w:tc>
-          <w:tcPr>
-            <w:tcW w:w="1700" w:type="dxa"/>
-            <w:tcBorders>
-              <w:top w:val="single" w:sz="4" w:space="0" w:color="808080"/>
-              <w:left w:val="single" w:sz="4" w:space="0" w:color="808080"/>
-              <w:bottom w:val="single" w:sz="4" w:space="0" w:color="808080"/>
-              <w:right w:val="single" w:sz="4" w:space="0" w:color="808080"/>
-            </w:tcBorders>
-            <w:tcMar>
-              <w:top w:w="60" w:type="dxa"/>
-              <w:left w:w="100" w:type="dxa"/>
-              <w:bottom w:w="60" w:type="dxa"/>
-              <w:right w:w="100" w:type="dxa"/>
-            </w:tcMar>
-            <w:vAlign w:val="center"/>
-          </w:tcPr>
-          <w:p>
-            <w:pPr>
-              <w:jc w:val="center"/>
-            </w:pPr>
-            <w:r>
-              <w:t>xxx/xxx (xx.x) [xx.x, xx.x]</w:t>
-            </w:r>
-          </w:p>
-        </w:tc>
-      </w:tr>
-      <w:tr>
-        <w:tc>
-          <w:tcPr>
-            <w:tcW w:w="3000" w:type="dxa"/>
-            <w:tcBorders>
-              <w:top w:val="single" w:sz="4" w:space="0" w:color="808080"/>
-              <w:left w:val="single" w:sz="4" w:space="0" w:color="808080"/>
-              <w:bottom w:val="single" w:sz="4" w:space="0" w:color="808080"/>
-              <w:right w:val="single" w:sz="4" w:space="0" w:color="808080"/>
-            </w:tcBorders>
-            <w:tcMar>
-              <w:top w:w="60" w:type="dxa"/>
-              <w:left w:w="100" w:type="dxa"/>
-              <w:bottom w:w="60" w:type="dxa"/>
-              <w:right w:w="100" w:type="dxa"/>
-            </w:tcMar>
-            <w:vAlign w:val="center"/>
-          </w:tcPr>
-          <w:p/>
-        </w:tc>
-        <w:tc>
-          <w:tcPr>
-            <w:tcW w:w="1100" w:type="dxa"/>
-            <w:tcBorders>
-              <w:top w:val="single" w:sz="4" w:space="0" w:color="808080"/>
-              <w:left w:val="single" w:sz="4" w:space="0" w:color="808080"/>
-              <w:bottom w:val="single" w:sz="4" w:space="0" w:color="808080"/>
-              <w:right w:val="single" w:sz="4" w:space="0" w:color="808080"/>
-            </w:tcBorders>
-            <w:tcMar>
-              <w:top w:w="60" w:type="dxa"/>
-              <w:left w:w="100" w:type="dxa"/>
-              <w:bottom w:w="60" w:type="dxa"/>
-              <w:right w:w="100" w:type="dxa"/>
-            </w:tcMar>
-            <w:vAlign w:val="center"/>
-          </w:tcPr>
-          <w:p>
-            <w:pPr>
-              <w:jc w:val="center"/>
-            </w:pPr>
-            <w:r>
-              <w:t>Wk 140</w:t>
-            </w:r>
-          </w:p>
-        </w:tc>
-        <w:tc>
-          <w:tcPr>
-            <w:tcW w:w="1700" w:type="dxa"/>
-            <w:tcBorders>
-              <w:top w:val="single" w:sz="4" w:space="0" w:color="808080"/>
-              <w:left w:val="single" w:sz="4" w:space="0" w:color="808080"/>
-              <w:bottom w:val="single" w:sz="4" w:space="0" w:color="808080"/>
-              <w:right w:val="single" w:sz="4" w:space="0" w:color="808080"/>
-            </w:tcBorders>
-            <w:tcMar>
-              <w:top w:w="60" w:type="dxa"/>
-              <w:left w:w="100" w:type="dxa"/>
-              <w:bottom w:w="60" w:type="dxa"/>
-              <w:right w:w="100" w:type="dxa"/>
-            </w:tcMar>
-            <w:vAlign w:val="center"/>
-          </w:tcPr>
-          <w:p>
-            <w:pPr>
-              <w:jc w:val="center"/>
-            </w:pPr>
-            <w:r>
-              <w:t>xxx/xxx (xx.x) [xx.x, xx.x]</w:t>
-            </w:r>
-          </w:p>
-        </w:tc>
-        <w:tc>
-          <w:tcPr>
-            <w:tcW w:w="1700" w:type="dxa"/>
-            <w:tcBorders>
-              <w:top w:val="single" w:sz="4" w:space="0" w:color="808080"/>
-              <w:left w:val="single" w:sz="4" w:space="0" w:color="808080"/>
-              <w:bottom w:val="single" w:sz="4" w:space="0" w:color="808080"/>
-              <w:right w:val="single" w:sz="4" w:space="0" w:color="808080"/>
-            </w:tcBorders>
-            <w:tcMar>
-              <w:top w:w="60" w:type="dxa"/>
-              <w:left w:w="100" w:type="dxa"/>
-              <w:bottom w:w="60" w:type="dxa"/>
-              <w:right w:w="100" w:type="dxa"/>
-            </w:tcMar>
-            <w:vAlign w:val="center"/>
-          </w:tcPr>
-          <w:p>
-            <w:pPr>
-              <w:jc w:val="center"/>
-            </w:pPr>
-            <w:r>
-              <w:t>xxx/xxx (xx.x) [xx.x, xx.x]</w:t>
-            </w:r>
-          </w:p>
-        </w:tc>
-        <w:tc>
-          <w:tcPr>
-            <w:tcW w:w="1700" w:type="dxa"/>
-            <w:tcBorders>
-              <w:top w:val="single" w:sz="4" w:space="0" w:color="808080"/>
-              <w:left w:val="single" w:sz="4" w:space="0" w:color="808080"/>
-              <w:bottom w:val="single" w:sz="4" w:space="0" w:color="808080"/>
-              <w:right w:val="single" w:sz="4" w:space="0" w:color="808080"/>
-            </w:tcBorders>
-            <w:tcMar>
-              <w:top w:w="60" w:type="dxa"/>
-              <w:left w:w="100" w:type="dxa"/>
-              <w:bottom w:w="60" w:type="dxa"/>
-              <w:right w:w="100" w:type="dxa"/>
-            </w:tcMar>
-            <w:vAlign w:val="center"/>
-          </w:tcPr>
-          <w:p>
-            <w:pPr>
-              <w:jc w:val="center"/>
-            </w:pPr>
-            <w:r>
-              <w:t>xxx/xxx (xx.x) [xx.x, xx.x]</w:t>
-            </w:r>
-          </w:p>
-        </w:tc>
-      </w:tr>
-      <w:tr>
-        <w:trPr>
-          <w:gridAfter w:val="4"/>
-          <w:wAfter w:w="6200" w:type="dxa"/>
-        </w:trPr>
-        <w:tc>
-          <w:tcPr>
-            <w:tcW w:w="9200" w:type="dxa"/>
-            <w:tcBorders>
-              <w:top w:val="single" w:sz="4" w:space="0" w:color="808080"/>
-              <w:left w:val="single" w:sz="4" w:space="0" w:color="808080"/>
-              <w:bottom w:val="single" w:sz="4" w:space="0" w:color="808080"/>
-              <w:right w:val="single" w:sz="4" w:space="0" w:color="808080"/>
-            </w:tcBorders>
-            <w:shd w:val="clear" w:color="auto" w:fill="D9E2F3"/>
-            <w:tcMar>
-              <w:top w:w="60" w:type="dxa"/>
-              <w:left w:w="100" w:type="dxa"/>
-              <w:bottom w:w="60" w:type="dxa"/>
-              <w:right w:w="100" w:type="dxa"/>
-            </w:tcMar>
-            <w:vAlign w:val="center"/>
-          </w:tcPr>
-          <w:p>
-            <w:r>
-              <w:t xml:space="preserve">EASI 90 (≥ 90% improvement from baseline in EASI)  </w:t>
-            </w:r>
-          </w:p>
-        </w:tc>
-      </w:tr>
-      <w:tr>
-        <w:tc>
-          <w:tcPr>
-            <w:tcW w:w="3000" w:type="dxa"/>
-            <w:tcBorders>
-              <w:top w:val="single" w:sz="4" w:space="0" w:color="808080"/>
-              <w:left w:val="single" w:sz="4" w:space="0" w:color="808080"/>
-              <w:bottom w:val="single" w:sz="4" w:space="0" w:color="808080"/>
-              <w:right w:val="single" w:sz="4" w:space="0" w:color="808080"/>
-            </w:tcBorders>
-            <w:tcMar>
-              <w:top w:w="60" w:type="dxa"/>
-              <w:left w:w="100" w:type="dxa"/>
-              <w:bottom w:w="60" w:type="dxa"/>
-              <w:right w:w="100" w:type="dxa"/>
-            </w:tcMar>
-            <w:vAlign w:val="center"/>
-          </w:tcPr>
-          <w:p>
-            <w:r>
-              <w:t>EASI 90 (≥ 90% improvement from baseline in EASI)</w:t>
-            </w:r>
-          </w:p>
-        </w:tc>
-        <w:tc>
-          <w:tcPr>
-            <w:tcW w:w="1100" w:type="dxa"/>
-            <w:tcBorders>
-              <w:top w:val="single" w:sz="4" w:space="0" w:color="808080"/>
-              <w:left w:val="single" w:sz="4" w:space="0" w:color="808080"/>
-              <w:bottom w:val="single" w:sz="4" w:space="0" w:color="808080"/>
-              <w:right w:val="single" w:sz="4" w:space="0" w:color="808080"/>
-            </w:tcBorders>
-            <w:tcMar>
-              <w:top w:w="60" w:type="dxa"/>
-              <w:left w:w="100" w:type="dxa"/>
-              <w:bottom w:w="60" w:type="dxa"/>
-              <w:right w:w="100" w:type="dxa"/>
-            </w:tcMar>
-            <w:vAlign w:val="center"/>
-          </w:tcPr>
-          <w:p>
-            <w:pPr>
-              <w:jc w:val="center"/>
-            </w:pPr>
-            <w:r>
-              <w:t>Wk 4</w:t>
-            </w:r>
-          </w:p>
-        </w:tc>
-        <w:tc>
-          <w:tcPr>
-            <w:tcW w:w="1700" w:type="dxa"/>
-            <w:tcBorders>
-              <w:top w:val="single" w:sz="4" w:space="0" w:color="808080"/>
-              <w:left w:val="single" w:sz="4" w:space="0" w:color="808080"/>
-              <w:bottom w:val="single" w:sz="4" w:space="0" w:color="808080"/>
-              <w:right w:val="single" w:sz="4" w:space="0" w:color="808080"/>
-            </w:tcBorders>
-            <w:tcMar>
-              <w:top w:w="60" w:type="dxa"/>
-              <w:left w:w="100" w:type="dxa"/>
-              <w:bottom w:w="60" w:type="dxa"/>
-              <w:right w:w="100" w:type="dxa"/>
-            </w:tcMar>
-            <w:vAlign w:val="center"/>
-          </w:tcPr>
-          <w:p>
-            <w:pPr>
-              <w:jc w:val="center"/>
-            </w:pPr>
-            <w:r>
-              <w:t>xxx/xxx (xx.x) [xx.x, xx.x]</w:t>
-            </w:r>
-          </w:p>
-        </w:tc>
-        <w:tc>
-          <w:tcPr>
-            <w:tcW w:w="1700" w:type="dxa"/>
-            <w:tcBorders>
-              <w:top w:val="single" w:sz="4" w:space="0" w:color="808080"/>
-              <w:left w:val="single" w:sz="4" w:space="0" w:color="808080"/>
-              <w:bottom w:val="single" w:sz="4" w:space="0" w:color="808080"/>
-              <w:right w:val="single" w:sz="4" w:space="0" w:color="808080"/>
-            </w:tcBorders>
-            <w:tcMar>
-              <w:top w:w="60" w:type="dxa"/>
-              <w:left w:w="100" w:type="dxa"/>
-              <w:bottom w:w="60" w:type="dxa"/>
-              <w:right w:w="100" w:type="dxa"/>
-            </w:tcMar>
-            <w:vAlign w:val="center"/>
-          </w:tcPr>
-          <w:p>
-            <w:pPr>
-              <w:jc w:val="center"/>
-            </w:pPr>
-            <w:r>
-              <w:t>xxx/xxx (xx.x) [xx.x, xx.x]</w:t>
-            </w:r>
-          </w:p>
-        </w:tc>
-        <w:tc>
-          <w:tcPr>
-            <w:tcW w:w="1700" w:type="dxa"/>
-            <w:tcBorders>
-              <w:top w:val="single" w:sz="4" w:space="0" w:color="808080"/>
-              <w:left w:val="single" w:sz="4" w:space="0" w:color="808080"/>
-              <w:bottom w:val="single" w:sz="4" w:space="0" w:color="808080"/>
-              <w:right w:val="single" w:sz="4" w:space="0" w:color="808080"/>
-            </w:tcBorders>
-            <w:tcMar>
-              <w:top w:w="60" w:type="dxa"/>
-              <w:left w:w="100" w:type="dxa"/>
-              <w:bottom w:w="60" w:type="dxa"/>
-              <w:right w:w="100" w:type="dxa"/>
-            </w:tcMar>
-            <w:vAlign w:val="center"/>
-          </w:tcPr>
-          <w:p>
-            <w:pPr>
-              <w:jc w:val="center"/>
-            </w:pPr>
-            <w:r>
-              <w:t>xxx/xxx (xx.x) [xx.x, xx.x]</w:t>
-            </w:r>
-          </w:p>
-        </w:tc>
-      </w:tr>
-      <w:tr>
-        <w:tc>
-          <w:tcPr>
-            <w:tcW w:w="3000" w:type="dxa"/>
-            <w:tcBorders>
-              <w:top w:val="single" w:sz="4" w:space="0" w:color="808080"/>
-              <w:left w:val="single" w:sz="4" w:space="0" w:color="808080"/>
-              <w:bottom w:val="single" w:sz="4" w:space="0" w:color="808080"/>
-              <w:right w:val="single" w:sz="4" w:space="0" w:color="808080"/>
-            </w:tcBorders>
-            <w:tcMar>
-              <w:top w:w="60" w:type="dxa"/>
-              <w:left w:w="100" w:type="dxa"/>
-              <w:bottom w:w="60" w:type="dxa"/>
-              <w:right w:w="100" w:type="dxa"/>
-            </w:tcMar>
-            <w:vAlign w:val="center"/>
-          </w:tcPr>
-          <w:p/>
-        </w:tc>
-        <w:tc>
-          <w:tcPr>
-            <w:tcW w:w="1100" w:type="dxa"/>
-            <w:tcBorders>
-              <w:top w:val="single" w:sz="4" w:space="0" w:color="808080"/>
-              <w:left w:val="single" w:sz="4" w:space="0" w:color="808080"/>
-              <w:bottom w:val="single" w:sz="4" w:space="0" w:color="808080"/>
-              <w:right w:val="single" w:sz="4" w:space="0" w:color="808080"/>
-            </w:tcBorders>
-            <w:tcMar>
-              <w:top w:w="60" w:type="dxa"/>
-              <w:left w:w="100" w:type="dxa"/>
-              <w:bottom w:w="60" w:type="dxa"/>
-              <w:right w:w="100" w:type="dxa"/>
-            </w:tcMar>
-            <w:vAlign w:val="center"/>
-          </w:tcPr>
-          <w:p>
-            <w:pPr>
-              <w:jc w:val="center"/>
-            </w:pPr>
-            <w:r>
-              <w:t>Wk 16</w:t>
-            </w:r>
-          </w:p>
-        </w:tc>
-        <w:tc>
-          <w:tcPr>
-            <w:tcW w:w="1700" w:type="dxa"/>
-            <w:tcBorders>
-              <w:top w:val="single" w:sz="4" w:space="0" w:color="808080"/>
-              <w:left w:val="single" w:sz="4" w:space="0" w:color="808080"/>
-              <w:bottom w:val="single" w:sz="4" w:space="0" w:color="808080"/>
-              <w:right w:val="single" w:sz="4" w:space="0" w:color="808080"/>
-            </w:tcBorders>
-            <w:tcMar>
-              <w:top w:w="60" w:type="dxa"/>
-              <w:left w:w="100" w:type="dxa"/>
-              <w:bottom w:w="60" w:type="dxa"/>
-              <w:right w:w="100" w:type="dxa"/>
-            </w:tcMar>
-            <w:vAlign w:val="center"/>
-          </w:tcPr>
-          <w:p>
-            <w:pPr>
-              <w:jc w:val="center"/>
-            </w:pPr>
-            <w:r>
-              <w:t>xxx/xxx (xx.x) [xx.x, xx.x]</w:t>
-            </w:r>
-          </w:p>
-        </w:tc>
-        <w:tc>
-          <w:tcPr>
-            <w:tcW w:w="1700" w:type="dxa"/>
-            <w:tcBorders>
-              <w:top w:val="single" w:sz="4" w:space="0" w:color="808080"/>
-              <w:left w:val="single" w:sz="4" w:space="0" w:color="808080"/>
-              <w:bottom w:val="single" w:sz="4" w:space="0" w:color="808080"/>
-              <w:right w:val="single" w:sz="4" w:space="0" w:color="808080"/>
-            </w:tcBorders>
-            <w:tcMar>
-              <w:top w:w="60" w:type="dxa"/>
-              <w:left w:w="100" w:type="dxa"/>
-              <w:bottom w:w="60" w:type="dxa"/>
-              <w:right w:w="100" w:type="dxa"/>
-            </w:tcMar>
-            <w:vAlign w:val="center"/>
-          </w:tcPr>
-          <w:p>
-            <w:pPr>
-              <w:jc w:val="center"/>
-            </w:pPr>
-            <w:r>
-              <w:t>xxx/xxx (xx.x) [xx.x, xx.x]</w:t>
-            </w:r>
-          </w:p>
-        </w:tc>
-        <w:tc>
-          <w:tcPr>
-            <w:tcW w:w="1700" w:type="dxa"/>
-            <w:tcBorders>
-              <w:top w:val="single" w:sz="4" w:space="0" w:color="808080"/>
-              <w:left w:val="single" w:sz="4" w:space="0" w:color="808080"/>
-              <w:bottom w:val="single" w:sz="4" w:space="0" w:color="808080"/>
-              <w:right w:val="single" w:sz="4" w:space="0" w:color="808080"/>
-            </w:tcBorders>
-            <w:tcMar>
-              <w:top w:w="60" w:type="dxa"/>
-              <w:left w:w="100" w:type="dxa"/>
-              <w:bottom w:w="60" w:type="dxa"/>
-              <w:right w:w="100" w:type="dxa"/>
-            </w:tcMar>
-            <w:vAlign w:val="center"/>
-          </w:tcPr>
-          <w:p>
-            <w:pPr>
-              <w:jc w:val="center"/>
-            </w:pPr>
-            <w:r>
-              <w:t>xxx/xxx (xx.x) [xx.x, xx.x]</w:t>
-            </w:r>
-          </w:p>
-        </w:tc>
-      </w:tr>
-      <w:tr>
-        <w:tc>
-          <w:tcPr>
-            <w:tcW w:w="3000" w:type="dxa"/>
-            <w:tcBorders>
-              <w:top w:val="single" w:sz="4" w:space="0" w:color="808080"/>
-              <w:left w:val="single" w:sz="4" w:space="0" w:color="808080"/>
-              <w:bottom w:val="single" w:sz="4" w:space="0" w:color="808080"/>
-              <w:right w:val="single" w:sz="4" w:space="0" w:color="808080"/>
-            </w:tcBorders>
-            <w:tcMar>
-              <w:top w:w="60" w:type="dxa"/>
-              <w:left w:w="100" w:type="dxa"/>
-              <w:bottom w:w="60" w:type="dxa"/>
-              <w:right w:w="100" w:type="dxa"/>
-            </w:tcMar>
-            <w:vAlign w:val="center"/>
-          </w:tcPr>
-          <w:p/>
-        </w:tc>
-        <w:tc>
-          <w:tcPr>
-            <w:tcW w:w="1100" w:type="dxa"/>
-            <w:tcBorders>
-              <w:top w:val="single" w:sz="4" w:space="0" w:color="808080"/>
-              <w:left w:val="single" w:sz="4" w:space="0" w:color="808080"/>
-              <w:bottom w:val="single" w:sz="4" w:space="0" w:color="808080"/>
-              <w:right w:val="single" w:sz="4" w:space="0" w:color="808080"/>
-            </w:tcBorders>
-            <w:tcMar>
-              <w:top w:w="60" w:type="dxa"/>
-              <w:left w:w="100" w:type="dxa"/>
-              <w:bottom w:w="60" w:type="dxa"/>
-              <w:right w:w="100" w:type="dxa"/>
-            </w:tcMar>
-            <w:vAlign w:val="center"/>
-          </w:tcPr>
-          <w:p>
-            <w:pPr>
-              <w:jc w:val="center"/>
-            </w:pPr>
-            <w:r>
-              <w:t>Wk 52</w:t>
-            </w:r>
-          </w:p>
-        </w:tc>
-        <w:tc>
-          <w:tcPr>
-            <w:tcW w:w="1700" w:type="dxa"/>
-            <w:tcBorders>
-              <w:top w:val="single" w:sz="4" w:space="0" w:color="808080"/>
-              <w:left w:val="single" w:sz="4" w:space="0" w:color="808080"/>
-              <w:bottom w:val="single" w:sz="4" w:space="0" w:color="808080"/>
-              <w:right w:val="single" w:sz="4" w:space="0" w:color="808080"/>
-            </w:tcBorders>
-            <w:tcMar>
-              <w:top w:w="60" w:type="dxa"/>
-              <w:left w:w="100" w:type="dxa"/>
-              <w:bottom w:w="60" w:type="dxa"/>
-              <w:right w:w="100" w:type="dxa"/>
-            </w:tcMar>
-            <w:vAlign w:val="center"/>
-          </w:tcPr>
-          <w:p>
-            <w:pPr>
-              <w:jc w:val="center"/>
-            </w:pPr>
-            <w:r>
-              <w:t>xxx/xxx (xx.x) [xx.x, xx.x]</w:t>
-            </w:r>
-          </w:p>
-        </w:tc>
-        <w:tc>
-          <w:tcPr>
-            <w:tcW w:w="1700" w:type="dxa"/>
-            <w:tcBorders>
-              <w:top w:val="single" w:sz="4" w:space="0" w:color="808080"/>
-              <w:left w:val="single" w:sz="4" w:space="0" w:color="808080"/>
-              <w:bottom w:val="single" w:sz="4" w:space="0" w:color="808080"/>
-              <w:right w:val="single" w:sz="4" w:space="0" w:color="808080"/>
-            </w:tcBorders>
-            <w:tcMar>
-              <w:top w:w="60" w:type="dxa"/>
-              <w:left w:w="100" w:type="dxa"/>
-              <w:bottom w:w="60" w:type="dxa"/>
-              <w:right w:w="100" w:type="dxa"/>
-            </w:tcMar>
-            <w:vAlign w:val="center"/>
-          </w:tcPr>
-          <w:p>
-            <w:pPr>
-              <w:jc w:val="center"/>
-            </w:pPr>
-            <w:r>
-              <w:t>xxx/xxx (xx.x) [xx.x, xx.x]</w:t>
-            </w:r>
-          </w:p>
-        </w:tc>
-        <w:tc>
-          <w:tcPr>
-            <w:tcW w:w="1700" w:type="dxa"/>
-            <w:tcBorders>
-              <w:top w:val="single" w:sz="4" w:space="0" w:color="808080"/>
-              <w:left w:val="single" w:sz="4" w:space="0" w:color="808080"/>
-              <w:bottom w:val="single" w:sz="4" w:space="0" w:color="808080"/>
-              <w:right w:val="single" w:sz="4" w:space="0" w:color="808080"/>
-            </w:tcBorders>
-            <w:tcMar>
-              <w:top w:w="60" w:type="dxa"/>
-              <w:left w:w="100" w:type="dxa"/>
-              <w:bottom w:w="60" w:type="dxa"/>
-              <w:right w:w="100" w:type="dxa"/>
-            </w:tcMar>
-            <w:vAlign w:val="center"/>
-          </w:tcPr>
-          <w:p>
-            <w:pPr>
-              <w:jc w:val="center"/>
-            </w:pPr>
-            <w:r>
-              <w:t>xxx/xxx (xx.x) [xx.x, xx.x]</w:t>
-            </w:r>
-          </w:p>
-        </w:tc>
-      </w:tr>
-      <w:tr>
-        <w:tc>
-          <w:tcPr>
-            <w:tcW w:w="3000" w:type="dxa"/>
-            <w:tcBorders>
-              <w:top w:val="single" w:sz="4" w:space="0" w:color="808080"/>
-              <w:left w:val="single" w:sz="4" w:space="0" w:color="808080"/>
-              <w:bottom w:val="single" w:sz="4" w:space="0" w:color="808080"/>
-              <w:right w:val="single" w:sz="4" w:space="0" w:color="808080"/>
-            </w:tcBorders>
-            <w:tcMar>
-              <w:top w:w="60" w:type="dxa"/>
-              <w:left w:w="100" w:type="dxa"/>
-              <w:bottom w:w="60" w:type="dxa"/>
-              <w:right w:w="100" w:type="dxa"/>
-            </w:tcMar>
-            <w:vAlign w:val="center"/>
-          </w:tcPr>
-          <w:p/>
-        </w:tc>
-        <w:tc>
-          <w:tcPr>
-            <w:tcW w:w="1100" w:type="dxa"/>
-            <w:tcBorders>
-              <w:top w:val="single" w:sz="4" w:space="0" w:color="808080"/>
-              <w:left w:val="single" w:sz="4" w:space="0" w:color="808080"/>
-              <w:bottom w:val="single" w:sz="4" w:space="0" w:color="808080"/>
-              <w:right w:val="single" w:sz="4" w:space="0" w:color="808080"/>
-            </w:tcBorders>
-            <w:tcMar>
-              <w:top w:w="60" w:type="dxa"/>
-              <w:left w:w="100" w:type="dxa"/>
-              <w:bottom w:w="60" w:type="dxa"/>
-              <w:right w:w="100" w:type="dxa"/>
-            </w:tcMar>
-            <w:vAlign w:val="center"/>
-          </w:tcPr>
-          <w:p>
-            <w:pPr>
-              <w:jc w:val="center"/>
-            </w:pPr>
-            <w:r>
-              <w:t>Wk 104</w:t>
-            </w:r>
-          </w:p>
-        </w:tc>
-        <w:tc>
-          <w:tcPr>
-            <w:tcW w:w="1700" w:type="dxa"/>
-            <w:tcBorders>
-              <w:top w:val="single" w:sz="4" w:space="0" w:color="808080"/>
-              <w:left w:val="single" w:sz="4" w:space="0" w:color="808080"/>
-              <w:bottom w:val="single" w:sz="4" w:space="0" w:color="808080"/>
-              <w:right w:val="single" w:sz="4" w:space="0" w:color="808080"/>
-            </w:tcBorders>
-            <w:tcMar>
-              <w:top w:w="60" w:type="dxa"/>
-              <w:left w:w="100" w:type="dxa"/>
-              <w:bottom w:w="60" w:type="dxa"/>
-              <w:right w:w="100" w:type="dxa"/>
-            </w:tcMar>
-            <w:vAlign w:val="center"/>
-          </w:tcPr>
-          <w:p>
-            <w:pPr>
-              <w:jc w:val="center"/>
-            </w:pPr>
-            <w:r>
-              <w:t>xxx/xxx (xx.x) [xx.x, xx.x]</w:t>
-            </w:r>
-          </w:p>
-        </w:tc>
-        <w:tc>
-          <w:tcPr>
-            <w:tcW w:w="1700" w:type="dxa"/>
-            <w:tcBorders>
-              <w:top w:val="single" w:sz="4" w:space="0" w:color="808080"/>
-              <w:left w:val="single" w:sz="4" w:space="0" w:color="808080"/>
-              <w:bottom w:val="single" w:sz="4" w:space="0" w:color="808080"/>
-              <w:right w:val="single" w:sz="4" w:space="0" w:color="808080"/>
-            </w:tcBorders>
-            <w:tcMar>
-              <w:top w:w="60" w:type="dxa"/>
-              <w:left w:w="100" w:type="dxa"/>
-              <w:bottom w:w="60" w:type="dxa"/>
-              <w:right w:w="100" w:type="dxa"/>
-            </w:tcMar>
-            <w:vAlign w:val="center"/>
-          </w:tcPr>
-          <w:p>
-            <w:pPr>
-              <w:jc w:val="center"/>
-            </w:pPr>
-            <w:r>
-              <w:t>xxx/xxx (xx.x) [xx.x, xx.x]</w:t>
-            </w:r>
-          </w:p>
-        </w:tc>
-        <w:tc>
-          <w:tcPr>
-            <w:tcW w:w="1700" w:type="dxa"/>
-            <w:tcBorders>
-              <w:top w:val="single" w:sz="4" w:space="0" w:color="808080"/>
-              <w:left w:val="single" w:sz="4" w:space="0" w:color="808080"/>
-              <w:bottom w:val="single" w:sz="4" w:space="0" w:color="808080"/>
-              <w:right w:val="single" w:sz="4" w:space="0" w:color="808080"/>
-            </w:tcBorders>
-            <w:tcMar>
-              <w:top w:w="60" w:type="dxa"/>
-              <w:left w:w="100" w:type="dxa"/>
-              <w:bottom w:w="60" w:type="dxa"/>
-              <w:right w:w="100" w:type="dxa"/>
-            </w:tcMar>
-            <w:vAlign w:val="center"/>
-          </w:tcPr>
-          <w:p>
-            <w:pPr>
-              <w:jc w:val="center"/>
-            </w:pPr>
-            <w:r>
-              <w:t>xxx/xxx (xx.x) [xx.x, xx.x]</w:t>
-            </w:r>
-          </w:p>
-        </w:tc>
-      </w:tr>
-      <w:tr>
-        <w:tc>
-          <w:tcPr>
-            <w:tcW w:w="3000" w:type="dxa"/>
-            <w:tcBorders>
-              <w:top w:val="single" w:sz="4" w:space="0" w:color="808080"/>
-              <w:left w:val="single" w:sz="4" w:space="0" w:color="808080"/>
-              <w:bottom w:val="single" w:sz="4" w:space="0" w:color="808080"/>
-              <w:right w:val="single" w:sz="4" w:space="0" w:color="808080"/>
-            </w:tcBorders>
-            <w:tcMar>
-              <w:top w:w="60" w:type="dxa"/>
-              <w:left w:w="100" w:type="dxa"/>
-              <w:bottom w:w="60" w:type="dxa"/>
-              <w:right w:w="100" w:type="dxa"/>
-            </w:tcMar>
-            <w:vAlign w:val="center"/>
-          </w:tcPr>
-          <w:p/>
-        </w:tc>
-        <w:tc>
-          <w:tcPr>
-            <w:tcW w:w="1100" w:type="dxa"/>
-            <w:tcBorders>
-              <w:top w:val="single" w:sz="4" w:space="0" w:color="808080"/>
-              <w:left w:val="single" w:sz="4" w:space="0" w:color="808080"/>
-              <w:bottom w:val="single" w:sz="4" w:space="0" w:color="808080"/>
-              <w:right w:val="single" w:sz="4" w:space="0" w:color="808080"/>
-            </w:tcBorders>
-            <w:tcMar>
-              <w:top w:w="60" w:type="dxa"/>
-              <w:left w:w="100" w:type="dxa"/>
-              <w:bottom w:w="60" w:type="dxa"/>
-              <w:right w:w="100" w:type="dxa"/>
-            </w:tcMar>
-            <w:vAlign w:val="center"/>
-          </w:tcPr>
-          <w:p>
-            <w:pPr>
-              <w:jc w:val="center"/>
-            </w:pPr>
-            <w:r>
-              <w:t>Wk 140</w:t>
-            </w:r>
-          </w:p>
-        </w:tc>
-        <w:tc>
-          <w:tcPr>
-            <w:tcW w:w="1700" w:type="dxa"/>
-            <w:tcBorders>
-              <w:top w:val="single" w:sz="4" w:space="0" w:color="808080"/>
-              <w:left w:val="single" w:sz="4" w:space="0" w:color="808080"/>
-              <w:bottom w:val="single" w:sz="4" w:space="0" w:color="808080"/>
-              <w:right w:val="single" w:sz="4" w:space="0" w:color="808080"/>
-            </w:tcBorders>
-            <w:tcMar>
-              <w:top w:w="60" w:type="dxa"/>
-              <w:left w:w="100" w:type="dxa"/>
-              <w:bottom w:w="60" w:type="dxa"/>
-              <w:right w:w="100" w:type="dxa"/>
-            </w:tcMar>
-            <w:vAlign w:val="center"/>
-          </w:tcPr>
-          <w:p>
-            <w:pPr>
-              <w:jc w:val="center"/>
-            </w:pPr>
-            <w:r>
-              <w:t>xxx/xxx (xx.x) [xx.x, xx.x]</w:t>
-            </w:r>
-          </w:p>
-        </w:tc>
-        <w:tc>
-          <w:tcPr>
-            <w:tcW w:w="1700" w:type="dxa"/>
-            <w:tcBorders>
-              <w:top w:val="single" w:sz="4" w:space="0" w:color="808080"/>
-              <w:left w:val="single" w:sz="4" w:space="0" w:color="808080"/>
-              <w:bottom w:val="single" w:sz="4" w:space="0" w:color="808080"/>
-              <w:right w:val="single" w:sz="4" w:space="0" w:color="808080"/>
-            </w:tcBorders>
-            <w:tcMar>
-              <w:top w:w="60" w:type="dxa"/>
-              <w:left w:w="100" w:type="dxa"/>
-              <w:bottom w:w="60" w:type="dxa"/>
-              <w:right w:w="100" w:type="dxa"/>
-            </w:tcMar>
-            <w:vAlign w:val="center"/>
-          </w:tcPr>
-          <w:p>
-            <w:pPr>
-              <w:jc w:val="center"/>
-            </w:pPr>
-            <w:r>
-              <w:t>xxx/xxx (xx.x) [xx.x, xx.x]</w:t>
-            </w:r>
-          </w:p>
-        </w:tc>
-        <w:tc>
-          <w:tcPr>
-            <w:tcW w:w="1700" w:type="dxa"/>
-            <w:tcBorders>
-              <w:top w:val="single" w:sz="4" w:space="0" w:color="808080"/>
-              <w:left w:val="single" w:sz="4" w:space="0" w:color="808080"/>
-              <w:bottom w:val="single" w:sz="4" w:space="0" w:color="808080"/>
-              <w:right w:val="single" w:sz="4" w:space="0" w:color="808080"/>
-            </w:tcBorders>
-            <w:tcMar>
-              <w:top w:w="60" w:type="dxa"/>
-              <w:left w:w="100" w:type="dxa"/>
-              <w:bottom w:w="60" w:type="dxa"/>
-              <w:right w:w="100" w:type="dxa"/>
-            </w:tcMar>
-            <w:vAlign w:val="center"/>
-          </w:tcPr>
-          <w:p>
-            <w:pPr>
-              <w:jc w:val="center"/>
-            </w:pPr>
-            <w:r>
-              <w:t>xxx/xxx (xx.x) [xx.x, xx.x]</w:t>
-            </w:r>
-          </w:p>
-        </w:tc>
-      </w:tr>
-      <w:tr>
-        <w:trPr>
-          <w:gridAfter w:val="4"/>
-          <w:wAfter w:w="6200" w:type="dxa"/>
-        </w:trPr>
-        <w:tc>
-          <w:tcPr>
-            <w:tcW w:w="9200" w:type="dxa"/>
-            <w:tcBorders>
-              <w:top w:val="single" w:sz="4" w:space="0" w:color="808080"/>
-              <w:left w:val="single" w:sz="4" w:space="0" w:color="808080"/>
-              <w:bottom w:val="single" w:sz="4" w:space="0" w:color="808080"/>
-              <w:right w:val="single" w:sz="4" w:space="0" w:color="808080"/>
-            </w:tcBorders>
-            <w:shd w:val="clear" w:color="auto" w:fill="D9E2F3"/>
-            <w:tcMar>
-              <w:top w:w="60" w:type="dxa"/>
-              <w:left w:w="100" w:type="dxa"/>
-              <w:bottom w:w="60" w:type="dxa"/>
-              <w:right w:w="100" w:type="dxa"/>
-            </w:tcMar>
-            <w:vAlign w:val="center"/>
-          </w:tcPr>
-          <w:p>
-            <w:r>
-              <w:t xml:space="preserve">EASI 100 (100% improvement from baseline in EASI)  </w:t>
-            </w:r>
-          </w:p>
-        </w:tc>
-      </w:tr>
-      <w:tr>
-        <w:tc>
-          <w:tcPr>
-            <w:tcW w:w="3000" w:type="dxa"/>
-            <w:tcBorders>
-              <w:top w:val="single" w:sz="4" w:space="0" w:color="808080"/>
-              <w:left w:val="single" w:sz="4" w:space="0" w:color="808080"/>
-              <w:bottom w:val="single" w:sz="4" w:space="0" w:color="808080"/>
-              <w:right w:val="single" w:sz="4" w:space="0" w:color="808080"/>
-            </w:tcBorders>
-            <w:tcMar>
-              <w:top w:w="60" w:type="dxa"/>
-              <w:left w:w="100" w:type="dxa"/>
-              <w:bottom w:w="60" w:type="dxa"/>
-              <w:right w:w="100" w:type="dxa"/>
-            </w:tcMar>
-            <w:vAlign w:val="center"/>
-          </w:tcPr>
-          <w:p>
-            <w:r>
-              <w:t>EASI 100 (100% improvement from baseline in EASI)</w:t>
-            </w:r>
-          </w:p>
-        </w:tc>
-        <w:tc>
-          <w:tcPr>
-            <w:tcW w:w="1100" w:type="dxa"/>
-            <w:tcBorders>
-              <w:top w:val="single" w:sz="4" w:space="0" w:color="808080"/>
-              <w:left w:val="single" w:sz="4" w:space="0" w:color="808080"/>
-              <w:bottom w:val="single" w:sz="4" w:space="0" w:color="808080"/>
-              <w:right w:val="single" w:sz="4" w:space="0" w:color="808080"/>
-            </w:tcBorders>
-            <w:tcMar>
-              <w:top w:w="60" w:type="dxa"/>
-              <w:left w:w="100" w:type="dxa"/>
-              <w:bottom w:w="60" w:type="dxa"/>
-              <w:right w:w="100" w:type="dxa"/>
-            </w:tcMar>
-            <w:vAlign w:val="center"/>
-          </w:tcPr>
-          <w:p>
-            <w:pPr>
-              <w:jc w:val="center"/>
-            </w:pPr>
-            <w:r>
-              <w:t>Wk 4</w:t>
-            </w:r>
-          </w:p>
-        </w:tc>
-        <w:tc>
-          <w:tcPr>
-            <w:tcW w:w="1700" w:type="dxa"/>
-            <w:tcBorders>
-              <w:top w:val="single" w:sz="4" w:space="0" w:color="808080"/>
-              <w:left w:val="single" w:sz="4" w:space="0" w:color="808080"/>
-              <w:bottom w:val="single" w:sz="4" w:space="0" w:color="808080"/>
-              <w:right w:val="single" w:sz="4" w:space="0" w:color="808080"/>
-            </w:tcBorders>
-            <w:tcMar>
-              <w:top w:w="60" w:type="dxa"/>
-              <w:left w:w="100" w:type="dxa"/>
-              <w:bottom w:w="60" w:type="dxa"/>
-              <w:right w:w="100" w:type="dxa"/>
-            </w:tcMar>
-            <w:vAlign w:val="center"/>
-          </w:tcPr>
-          <w:p>
-            <w:pPr>
-              <w:jc w:val="center"/>
-            </w:pPr>
-            <w:r>
-              <w:t>xxx/xxx (xx.x) [xx.x, xx.x]</w:t>
-            </w:r>
-          </w:p>
-        </w:tc>
-        <w:tc>
-          <w:tcPr>
-            <w:tcW w:w="1700" w:type="dxa"/>
-            <w:tcBorders>
-              <w:top w:val="single" w:sz="4" w:space="0" w:color="808080"/>
-              <w:left w:val="single" w:sz="4" w:space="0" w:color="808080"/>
-              <w:bottom w:val="single" w:sz="4" w:space="0" w:color="808080"/>
-              <w:right w:val="single" w:sz="4" w:space="0" w:color="808080"/>
-            </w:tcBorders>
-            <w:tcMar>
-              <w:top w:w="60" w:type="dxa"/>
-              <w:left w:w="100" w:type="dxa"/>
-              <w:bottom w:w="60" w:type="dxa"/>
-              <w:right w:w="100" w:type="dxa"/>
-            </w:tcMar>
-            <w:vAlign w:val="center"/>
-          </w:tcPr>
-          <w:p>
-            <w:pPr>
-              <w:jc w:val="center"/>
-            </w:pPr>
-            <w:r>
-              <w:t>xxx/xxx (xx.x) [xx.x, xx.x]</w:t>
-            </w:r>
-          </w:p>
-        </w:tc>
-        <w:tc>
-          <w:tcPr>
-            <w:tcW w:w="1700" w:type="dxa"/>
-            <w:tcBorders>
-              <w:top w:val="single" w:sz="4" w:space="0" w:color="808080"/>
-              <w:left w:val="single" w:sz="4" w:space="0" w:color="808080"/>
-              <w:bottom w:val="single" w:sz="4" w:space="0" w:color="808080"/>
-              <w:right w:val="single" w:sz="4" w:space="0" w:color="808080"/>
-            </w:tcBorders>
-            <w:tcMar>
-              <w:top w:w="60" w:type="dxa"/>
-              <w:left w:w="100" w:type="dxa"/>
-              <w:bottom w:w="60" w:type="dxa"/>
-              <w:right w:w="100" w:type="dxa"/>
-            </w:tcMar>
-            <w:vAlign w:val="center"/>
-          </w:tcPr>
-          <w:p>
-            <w:pPr>
-              <w:jc w:val="center"/>
-            </w:pPr>
-            <w:r>
-              <w:t>xxx/xxx (xx.x) [xx.x, xx.x]</w:t>
-            </w:r>
-          </w:p>
-        </w:tc>
-      </w:tr>
-      <w:tr>
-        <w:tc>
-          <w:tcPr>
-            <w:tcW w:w="3000" w:type="dxa"/>
-            <w:tcBorders>
-              <w:top w:val="single" w:sz="4" w:space="0" w:color="808080"/>
-              <w:left w:val="single" w:sz="4" w:space="0" w:color="808080"/>
-              <w:bottom w:val="single" w:sz="4" w:space="0" w:color="808080"/>
-              <w:right w:val="single" w:sz="4" w:space="0" w:color="808080"/>
-            </w:tcBorders>
-            <w:tcMar>
-              <w:top w:w="60" w:type="dxa"/>
-              <w:left w:w="100" w:type="dxa"/>
-              <w:bottom w:w="60" w:type="dxa"/>
-              <w:right w:w="100" w:type="dxa"/>
-            </w:tcMar>
-            <w:vAlign w:val="center"/>
-          </w:tcPr>
-          <w:p/>
-        </w:tc>
-        <w:tc>
-          <w:tcPr>
-            <w:tcW w:w="1100" w:type="dxa"/>
-            <w:tcBorders>
-              <w:top w:val="single" w:sz="4" w:space="0" w:color="808080"/>
-              <w:left w:val="single" w:sz="4" w:space="0" w:color="808080"/>
-              <w:bottom w:val="single" w:sz="4" w:space="0" w:color="808080"/>
-              <w:right w:val="single" w:sz="4" w:space="0" w:color="808080"/>
-            </w:tcBorders>
-            <w:tcMar>
-              <w:top w:w="60" w:type="dxa"/>
-              <w:left w:w="100" w:type="dxa"/>
-              <w:bottom w:w="60" w:type="dxa"/>
-              <w:right w:w="100" w:type="dxa"/>
-            </w:tcMar>
-            <w:vAlign w:val="center"/>
-          </w:tcPr>
-          <w:p>
-            <w:pPr>
-              <w:jc w:val="center"/>
-            </w:pPr>
-            <w:r>
-              <w:t>Wk 16</w:t>
-            </w:r>
-          </w:p>
-        </w:tc>
-        <w:tc>
-          <w:tcPr>
-            <w:tcW w:w="1700" w:type="dxa"/>
-            <w:tcBorders>
-              <w:top w:val="single" w:sz="4" w:space="0" w:color="808080"/>
-              <w:left w:val="single" w:sz="4" w:space="0" w:color="808080"/>
-              <w:bottom w:val="single" w:sz="4" w:space="0" w:color="808080"/>
-              <w:right w:val="single" w:sz="4" w:space="0" w:color="808080"/>
-            </w:tcBorders>
-            <w:tcMar>
-              <w:top w:w="60" w:type="dxa"/>
-              <w:left w:w="100" w:type="dxa"/>
-              <w:bottom w:w="60" w:type="dxa"/>
-              <w:right w:w="100" w:type="dxa"/>
-            </w:tcMar>
-            <w:vAlign w:val="center"/>
-          </w:tcPr>
-          <w:p>
-            <w:pPr>
-              <w:jc w:val="center"/>
-            </w:pPr>
-            <w:r>
-              <w:t>xxx/xxx (xx.x) [xx.x, xx.x]</w:t>
-            </w:r>
-          </w:p>
-        </w:tc>
-        <w:tc>
-          <w:tcPr>
-            <w:tcW w:w="1700" w:type="dxa"/>
-            <w:tcBorders>
-              <w:top w:val="single" w:sz="4" w:space="0" w:color="808080"/>
-              <w:left w:val="single" w:sz="4" w:space="0" w:color="808080"/>
-              <w:bottom w:val="single" w:sz="4" w:space="0" w:color="808080"/>
-              <w:right w:val="single" w:sz="4" w:space="0" w:color="808080"/>
-            </w:tcBorders>
-            <w:tcMar>
-              <w:top w:w="60" w:type="dxa"/>
-              <w:left w:w="100" w:type="dxa"/>
-              <w:bottom w:w="60" w:type="dxa"/>
-              <w:right w:w="100" w:type="dxa"/>
-            </w:tcMar>
-            <w:vAlign w:val="center"/>
-          </w:tcPr>
-          <w:p>
-            <w:pPr>
-              <w:jc w:val="center"/>
-            </w:pPr>
-            <w:r>
-              <w:t>xxx/xxx (xx.x) [xx.x, xx.x]</w:t>
-            </w:r>
-          </w:p>
-        </w:tc>
-        <w:tc>
-          <w:tcPr>
-            <w:tcW w:w="1700" w:type="dxa"/>
-            <w:tcBorders>
-              <w:top w:val="single" w:sz="4" w:space="0" w:color="808080"/>
-              <w:left w:val="single" w:sz="4" w:space="0" w:color="808080"/>
-              <w:bottom w:val="single" w:sz="4" w:space="0" w:color="808080"/>
-              <w:right w:val="single" w:sz="4" w:space="0" w:color="808080"/>
-            </w:tcBorders>
-            <w:tcMar>
-              <w:top w:w="60" w:type="dxa"/>
-              <w:left w:w="100" w:type="dxa"/>
-              <w:bottom w:w="60" w:type="dxa"/>
-              <w:right w:w="100" w:type="dxa"/>
-            </w:tcMar>
-            <w:vAlign w:val="center"/>
-          </w:tcPr>
-          <w:p>
-            <w:pPr>
-              <w:jc w:val="center"/>
-            </w:pPr>
-            <w:r>
-              <w:t>xxx/xxx (xx.x) [xx.x, xx.x]</w:t>
-            </w:r>
-          </w:p>
-        </w:tc>
-      </w:tr>
-      <w:tr>
-        <w:tc>
-          <w:tcPr>
-            <w:tcW w:w="3000" w:type="dxa"/>
-            <w:tcBorders>
-              <w:top w:val="single" w:sz="4" w:space="0" w:color="808080"/>
-              <w:left w:val="single" w:sz="4" w:space="0" w:color="808080"/>
-              <w:bottom w:val="single" w:sz="4" w:space="0" w:color="808080"/>
-              <w:right w:val="single" w:sz="4" w:space="0" w:color="808080"/>
-            </w:tcBorders>
-            <w:tcMar>
-              <w:top w:w="60" w:type="dxa"/>
-              <w:left w:w="100" w:type="dxa"/>
-              <w:bottom w:w="60" w:type="dxa"/>
-              <w:right w:w="100" w:type="dxa"/>
-            </w:tcMar>
-            <w:vAlign w:val="center"/>
-          </w:tcPr>
-          <w:p/>
-        </w:tc>
-        <w:tc>
-          <w:tcPr>
-            <w:tcW w:w="1100" w:type="dxa"/>
-            <w:tcBorders>
-              <w:top w:val="single" w:sz="4" w:space="0" w:color="808080"/>
-              <w:left w:val="single" w:sz="4" w:space="0" w:color="808080"/>
-              <w:bottom w:val="single" w:sz="4" w:space="0" w:color="808080"/>
-              <w:right w:val="single" w:sz="4" w:space="0" w:color="808080"/>
-            </w:tcBorders>
-            <w:tcMar>
-              <w:top w:w="60" w:type="dxa"/>
-              <w:left w:w="100" w:type="dxa"/>
-              <w:bottom w:w="60" w:type="dxa"/>
-              <w:right w:w="100" w:type="dxa"/>
-            </w:tcMar>
-            <w:vAlign w:val="center"/>
-          </w:tcPr>
-          <w:p>
-            <w:pPr>
-              <w:jc w:val="center"/>
-            </w:pPr>
-            <w:r>
-              <w:t>Wk 52</w:t>
-            </w:r>
-          </w:p>
-        </w:tc>
-        <w:tc>
-          <w:tcPr>
-            <w:tcW w:w="1700" w:type="dxa"/>
-            <w:tcBorders>
-              <w:top w:val="single" w:sz="4" w:space="0" w:color="808080"/>
-              <w:left w:val="single" w:sz="4" w:space="0" w:color="808080"/>
-              <w:bottom w:val="single" w:sz="4" w:space="0" w:color="808080"/>
-              <w:right w:val="single" w:sz="4" w:space="0" w:color="808080"/>
-            </w:tcBorders>
-            <w:tcMar>
-              <w:top w:w="60" w:type="dxa"/>
-              <w:left w:w="100" w:type="dxa"/>
-              <w:bottom w:w="60" w:type="dxa"/>
-              <w:right w:w="100" w:type="dxa"/>
-            </w:tcMar>
-            <w:vAlign w:val="center"/>
-          </w:tcPr>
-          <w:p>
-            <w:pPr>
-              <w:jc w:val="center"/>
-            </w:pPr>
-            <w:r>
-              <w:t>xxx/xxx (xx.x) [xx.x, xx.x]</w:t>
-            </w:r>
-          </w:p>
-        </w:tc>
-        <w:tc>
-          <w:tcPr>
-            <w:tcW w:w="1700" w:type="dxa"/>
-            <w:tcBorders>
-              <w:top w:val="single" w:sz="4" w:space="0" w:color="808080"/>
-              <w:left w:val="single" w:sz="4" w:space="0" w:color="808080"/>
-              <w:bottom w:val="single" w:sz="4" w:space="0" w:color="808080"/>
-              <w:right w:val="single" w:sz="4" w:space="0" w:color="808080"/>
-            </w:tcBorders>
-            <w:tcMar>
-              <w:top w:w="60" w:type="dxa"/>
-              <w:left w:w="100" w:type="dxa"/>
-              <w:bottom w:w="60" w:type="dxa"/>
-              <w:right w:w="100" w:type="dxa"/>
-            </w:tcMar>
-            <w:vAlign w:val="center"/>
-          </w:tcPr>
-          <w:p>
-            <w:pPr>
-              <w:jc w:val="center"/>
-            </w:pPr>
-            <w:r>
-              <w:t>xxx/xxx (xx.x) [xx.x, xx.x]</w:t>
-            </w:r>
-          </w:p>
-        </w:tc>
-        <w:tc>
-          <w:tcPr>
-            <w:tcW w:w="1700" w:type="dxa"/>
-            <w:tcBorders>
-              <w:top w:val="single" w:sz="4" w:space="0" w:color="808080"/>
-              <w:left w:val="single" w:sz="4" w:space="0" w:color="808080"/>
-              <w:bottom w:val="single" w:sz="4" w:space="0" w:color="808080"/>
-              <w:right w:val="single" w:sz="4" w:space="0" w:color="808080"/>
-            </w:tcBorders>
-            <w:tcMar>
-              <w:top w:w="60" w:type="dxa"/>
-              <w:left w:w="100" w:type="dxa"/>
-              <w:bottom w:w="60" w:type="dxa"/>
-              <w:right w:w="100" w:type="dxa"/>
-            </w:tcMar>
-            <w:vAlign w:val="center"/>
-          </w:tcPr>
-          <w:p>
-            <w:pPr>
-              <w:jc w:val="center"/>
-            </w:pPr>
-            <w:r>
-              <w:t>xxx/xxx (xx.x) [xx.x, xx.x]</w:t>
-            </w:r>
-          </w:p>
-        </w:tc>
-      </w:tr>
-      <w:tr>
-        <w:tc>
-          <w:tcPr>
-            <w:tcW w:w="3000" w:type="dxa"/>
-            <w:tcBorders>
-              <w:top w:val="single" w:sz="4" w:space="0" w:color="808080"/>
-              <w:left w:val="single" w:sz="4" w:space="0" w:color="808080"/>
-              <w:bottom w:val="single" w:sz="4" w:space="0" w:color="808080"/>
-              <w:right w:val="single" w:sz="4" w:space="0" w:color="808080"/>
-            </w:tcBorders>
-            <w:tcMar>
-              <w:top w:w="60" w:type="dxa"/>
-              <w:left w:w="100" w:type="dxa"/>
-              <w:bottom w:w="60" w:type="dxa"/>
-              <w:right w:w="100" w:type="dxa"/>
-            </w:tcMar>
-            <w:vAlign w:val="center"/>
-          </w:tcPr>
-          <w:p/>
-        </w:tc>
-        <w:tc>
-          <w:tcPr>
-            <w:tcW w:w="1100" w:type="dxa"/>
-            <w:tcBorders>
-              <w:top w:val="single" w:sz="4" w:space="0" w:color="808080"/>
-              <w:left w:val="single" w:sz="4" w:space="0" w:color="808080"/>
-              <w:bottom w:val="single" w:sz="4" w:space="0" w:color="808080"/>
-              <w:right w:val="single" w:sz="4" w:space="0" w:color="808080"/>
-            </w:tcBorders>
-            <w:tcMar>
-              <w:top w:w="60" w:type="dxa"/>
-              <w:left w:w="100" w:type="dxa"/>
-              <w:bottom w:w="60" w:type="dxa"/>
-              <w:right w:w="100" w:type="dxa"/>
-            </w:tcMar>
-            <w:vAlign w:val="center"/>
-          </w:tcPr>
-          <w:p>
-            <w:pPr>
-              <w:jc w:val="center"/>
-            </w:pPr>
-            <w:r>
-              <w:t>Wk 104</w:t>
-            </w:r>
-          </w:p>
-        </w:tc>
-        <w:tc>
-          <w:tcPr>
-            <w:tcW w:w="1700" w:type="dxa"/>
-            <w:tcBorders>
-              <w:top w:val="single" w:sz="4" w:space="0" w:color="808080"/>
-              <w:left w:val="single" w:sz="4" w:space="0" w:color="808080"/>
-              <w:bottom w:val="single" w:sz="4" w:space="0" w:color="808080"/>
-              <w:right w:val="single" w:sz="4" w:space="0" w:color="808080"/>
-            </w:tcBorders>
-            <w:tcMar>
-              <w:top w:w="60" w:type="dxa"/>
-              <w:left w:w="100" w:type="dxa"/>
-              <w:bottom w:w="60" w:type="dxa"/>
-              <w:right w:w="100" w:type="dxa"/>
-            </w:tcMar>
-            <w:vAlign w:val="center"/>
-          </w:tcPr>
-          <w:p>
-            <w:pPr>
-              <w:jc w:val="center"/>
-            </w:pPr>
-            <w:r>
-              <w:t>xxx/xxx (xx.x) [xx.x, xx.x]</w:t>
-            </w:r>
-          </w:p>
-        </w:tc>
-        <w:tc>
-          <w:tcPr>
-            <w:tcW w:w="1700" w:type="dxa"/>
-            <w:tcBorders>
-              <w:top w:val="single" w:sz="4" w:space="0" w:color="808080"/>
-              <w:left w:val="single" w:sz="4" w:space="0" w:color="808080"/>
-              <w:bottom w:val="single" w:sz="4" w:space="0" w:color="808080"/>
-              <w:right w:val="single" w:sz="4" w:space="0" w:color="808080"/>
-            </w:tcBorders>
-            <w:tcMar>
-              <w:top w:w="60" w:type="dxa"/>
-              <w:left w:w="100" w:type="dxa"/>
-              <w:bottom w:w="60" w:type="dxa"/>
-              <w:right w:w="100" w:type="dxa"/>
-            </w:tcMar>
-            <w:vAlign w:val="center"/>
-          </w:tcPr>
-          <w:p>
-            <w:pPr>
-              <w:jc w:val="center"/>
-            </w:pPr>
-            <w:r>
-              <w:t>xxx/xxx (xx.x) [xx.x, xx.x]</w:t>
-            </w:r>
-          </w:p>
-        </w:tc>
-        <w:tc>
-          <w:tcPr>
-            <w:tcW w:w="1700" w:type="dxa"/>
-            <w:tcBorders>
-              <w:top w:val="single" w:sz="4" w:space="0" w:color="808080"/>
-              <w:left w:val="single" w:sz="4" w:space="0" w:color="808080"/>
-              <w:bottom w:val="single" w:sz="4" w:space="0" w:color="808080"/>
-              <w:right w:val="single" w:sz="4" w:space="0" w:color="808080"/>
-            </w:tcBorders>
-            <w:tcMar>
-              <w:top w:w="60" w:type="dxa"/>
-              <w:left w:w="100" w:type="dxa"/>
-              <w:bottom w:w="60" w:type="dxa"/>
-              <w:right w:w="100" w:type="dxa"/>
-            </w:tcMar>
-            <w:vAlign w:val="center"/>
-          </w:tcPr>
-          <w:p>
-            <w:pPr>
-              <w:jc w:val="center"/>
-            </w:pPr>
-            <w:r>
-              <w:t>xxx/xxx (xx.x) [xx.x, xx.x]</w:t>
-            </w:r>
-          </w:p>
-        </w:tc>
-      </w:tr>
-      <w:tr>
-        <w:tc>
-          <w:tcPr>
-            <w:tcW w:w="3000" w:type="dxa"/>
-            <w:tcBorders>
-              <w:top w:val="single" w:sz="4" w:space="0" w:color="808080"/>
-              <w:left w:val="single" w:sz="4" w:space="0" w:color="808080"/>
-              <w:bottom w:val="single" w:sz="4" w:space="0" w:color="808080"/>
-              <w:right w:val="single" w:sz="4" w:space="0" w:color="808080"/>
-            </w:tcBorders>
-            <w:tcMar>
-              <w:top w:w="60" w:type="dxa"/>
-              <w:left w:w="100" w:type="dxa"/>
-              <w:bottom w:w="60" w:type="dxa"/>
-              <w:right w:w="100" w:type="dxa"/>
-            </w:tcMar>
-            <w:vAlign w:val="center"/>
-          </w:tcPr>
-          <w:p/>
-        </w:tc>
-        <w:tc>
-          <w:tcPr>
-            <w:tcW w:w="1100" w:type="dxa"/>
-            <w:tcBorders>
-              <w:top w:val="single" w:sz="4" w:space="0" w:color="808080"/>
-              <w:left w:val="single" w:sz="4" w:space="0" w:color="808080"/>
-              <w:bottom w:val="single" w:sz="4" w:space="0" w:color="808080"/>
-              <w:right w:val="single" w:sz="4" w:space="0" w:color="808080"/>
-            </w:tcBorders>
-            <w:tcMar>
-              <w:top w:w="60" w:type="dxa"/>
-              <w:left w:w="100" w:type="dxa"/>
-              <w:bottom w:w="60" w:type="dxa"/>
-              <w:right w:w="100" w:type="dxa"/>
-            </w:tcMar>
-            <w:vAlign w:val="center"/>
-          </w:tcPr>
-          <w:p>
-            <w:pPr>
-              <w:jc w:val="center"/>
-            </w:pPr>
-            <w:r>
-              <w:t>Wk 140</w:t>
-            </w:r>
-          </w:p>
-        </w:tc>
-        <w:tc>
-          <w:tcPr>
-            <w:tcW w:w="1700" w:type="dxa"/>
-            <w:tcBorders>
-              <w:top w:val="single" w:sz="4" w:space="0" w:color="808080"/>
-              <w:left w:val="single" w:sz="4" w:space="0" w:color="808080"/>
-              <w:bottom w:val="single" w:sz="4" w:space="0" w:color="808080"/>
-              <w:right w:val="single" w:sz="4" w:space="0" w:color="808080"/>
-            </w:tcBorders>
-            <w:tcMar>
-              <w:top w:w="60" w:type="dxa"/>
-              <w:left w:w="100" w:type="dxa"/>
-              <w:bottom w:w="60" w:type="dxa"/>
-              <w:right w:w="100" w:type="dxa"/>
-            </w:tcMar>
-            <w:vAlign w:val="center"/>
-          </w:tcPr>
-          <w:p>
-            <w:pPr>
-              <w:jc w:val="center"/>
-            </w:pPr>
-            <w:r>
-              <w:t>xxx/xxx (xx.x) [xx.x, xx.x]</w:t>
-            </w:r>
-          </w:p>
-        </w:tc>
-        <w:tc>
-          <w:tcPr>
-            <w:tcW w:w="1700" w:type="dxa"/>
-            <w:tcBorders>
-              <w:top w:val="single" w:sz="4" w:space="0" w:color="808080"/>
-              <w:left w:val="single" w:sz="4" w:space="0" w:color="808080"/>
-              <w:bottom w:val="single" w:sz="4" w:space="0" w:color="808080"/>
-              <w:right w:val="single" w:sz="4" w:space="0" w:color="808080"/>
-            </w:tcBorders>
-            <w:tcMar>
-              <w:top w:w="60" w:type="dxa"/>
-              <w:left w:w="100" w:type="dxa"/>
-              <w:bottom w:w="60" w:type="dxa"/>
-              <w:right w:w="100" w:type="dxa"/>
-            </w:tcMar>
-            <w:vAlign w:val="center"/>
-          </w:tcPr>
-          <w:p>
-            <w:pPr>
-              <w:jc w:val="center"/>
-            </w:pPr>
-            <w:r>
-              <w:t>xxx/xxx (xx.x) [xx.x, xx.x]</w:t>
-            </w:r>
-          </w:p>
-        </w:tc>
-        <w:tc>
-          <w:tcPr>
-            <w:tcW w:w="1700" w:type="dxa"/>
-            <w:tcBorders>
-              <w:top w:val="single" w:sz="4" w:space="0" w:color="808080"/>
-              <w:left w:val="single" w:sz="4" w:space="0" w:color="808080"/>
-              <w:bottom w:val="single" w:sz="4" w:space="0" w:color="808080"/>
-              <w:right w:val="single" w:sz="4" w:space="0" w:color="808080"/>
-            </w:tcBorders>
-            <w:tcMar>
-              <w:top w:w="60" w:type="dxa"/>
-              <w:left w:w="100" w:type="dxa"/>
-              <w:bottom w:w="60" w:type="dxa"/>
-              <w:right w:w="100" w:type="dxa"/>
-            </w:tcMar>
-            <w:vAlign w:val="center"/>
-          </w:tcPr>
-          <w:p>
-            <w:pPr>
-              <w:jc w:val="center"/>
-            </w:pPr>
-            <w:r>
-              <w:t>xxx/xxx (xx.x) [xx.x, xx.x]</w:t>
-            </w:r>
-          </w:p>
-        </w:tc>
-      </w:tr>
-      <w:tr>
-        <w:trPr>
-          <w:gridAfter w:val="4"/>
-          <w:wAfter w:w="6200" w:type="dxa"/>
-        </w:trPr>
-        <w:tc>
-          <w:tcPr>
-            <w:tcW w:w="9200" w:type="dxa"/>
-            <w:tcBorders>
-              <w:top w:val="single" w:sz="4" w:space="0" w:color="808080"/>
-              <w:left w:val="single" w:sz="4" w:space="0" w:color="808080"/>
-              <w:bottom w:val="single" w:sz="4" w:space="0" w:color="808080"/>
-              <w:right w:val="single" w:sz="4" w:space="0" w:color="808080"/>
-            </w:tcBorders>
-            <w:shd w:val="clear" w:color="auto" w:fill="D9E2F3"/>
-            <w:tcMar>
-              <w:top w:w="60" w:type="dxa"/>
-              <w:left w:w="100" w:type="dxa"/>
-              <w:bottom w:w="60" w:type="dxa"/>
-              <w:right w:w="100" w:type="dxa"/>
-            </w:tcMar>
-            <w:vAlign w:val="center"/>
-          </w:tcPr>
-          <w:p>
-            <w:r>
-              <w:t xml:space="preserve">EASI ≤ 3 (AHEAD optimal target for skin clearance)  </w:t>
-            </w:r>
-          </w:p>
-        </w:tc>
-      </w:tr>
-      <w:tr>
-        <w:tc>
-          <w:tcPr>
-            <w:tcW w:w="3000" w:type="dxa"/>
-            <w:tcBorders>
-              <w:top w:val="single" w:sz="4" w:space="0" w:color="808080"/>
-              <w:left w:val="single" w:sz="4" w:space="0" w:color="808080"/>
-              <w:bottom w:val="single" w:sz="4" w:space="0" w:color="808080"/>
-              <w:right w:val="single" w:sz="4" w:space="0" w:color="808080"/>
-            </w:tcBorders>
-            <w:tcMar>
-              <w:top w:w="60" w:type="dxa"/>
-              <w:left w:w="100" w:type="dxa"/>
-              <w:bottom w:w="60" w:type="dxa"/>
-              <w:right w:w="100" w:type="dxa"/>
-            </w:tcMar>
-            <w:vAlign w:val="center"/>
-          </w:tcPr>
-          <w:p>
-            <w:r>
-              <w:t>EASI ≤ 3 (AHEAD optimal target for skin clearance)</w:t>
-            </w:r>
-          </w:p>
-        </w:tc>
-        <w:tc>
-          <w:tcPr>
-            <w:tcW w:w="1100" w:type="dxa"/>
-            <w:tcBorders>
-              <w:top w:val="single" w:sz="4" w:space="0" w:color="808080"/>
-              <w:left w:val="single" w:sz="4" w:space="0" w:color="808080"/>
-              <w:bottom w:val="single" w:sz="4" w:space="0" w:color="808080"/>
-              <w:right w:val="single" w:sz="4" w:space="0" w:color="808080"/>
-            </w:tcBorders>
-            <w:tcMar>
-              <w:top w:w="60" w:type="dxa"/>
-              <w:left w:w="100" w:type="dxa"/>
-              <w:bottom w:w="60" w:type="dxa"/>
-              <w:right w:w="100" w:type="dxa"/>
-            </w:tcMar>
-            <w:vAlign w:val="center"/>
-          </w:tcPr>
-          <w:p>
-            <w:pPr>
-              <w:jc w:val="center"/>
-            </w:pPr>
-            <w:r>
-              <w:t>Wk 4</w:t>
-            </w:r>
-          </w:p>
-        </w:tc>
-        <w:tc>
-          <w:tcPr>
-            <w:tcW w:w="1700" w:type="dxa"/>
-            <w:tcBorders>
-              <w:top w:val="single" w:sz="4" w:space="0" w:color="808080"/>
-              <w:left w:val="single" w:sz="4" w:space="0" w:color="808080"/>
-              <w:bottom w:val="single" w:sz="4" w:space="0" w:color="808080"/>
-              <w:right w:val="single" w:sz="4" w:space="0" w:color="808080"/>
-            </w:tcBorders>
-            <w:tcMar>
-              <w:top w:w="60" w:type="dxa"/>
-              <w:left w:w="100" w:type="dxa"/>
-              <w:bottom w:w="60" w:type="dxa"/>
-              <w:right w:w="100" w:type="dxa"/>
-            </w:tcMar>
-            <w:vAlign w:val="center"/>
-          </w:tcPr>
-          <w:p>
-            <w:pPr>
-              <w:jc w:val="center"/>
-            </w:pPr>
-            <w:r>
-              <w:t>xxx/xxx (xx.x) [xx.x, xx.x]</w:t>
-            </w:r>
-          </w:p>
-        </w:tc>
-        <w:tc>
-          <w:tcPr>
-            <w:tcW w:w="1700" w:type="dxa"/>
-            <w:tcBorders>
-              <w:top w:val="single" w:sz="4" w:space="0" w:color="808080"/>
-              <w:left w:val="single" w:sz="4" w:space="0" w:color="808080"/>
-              <w:bottom w:val="single" w:sz="4" w:space="0" w:color="808080"/>
-              <w:right w:val="single" w:sz="4" w:space="0" w:color="808080"/>
-            </w:tcBorders>
-            <w:tcMar>
-              <w:top w:w="60" w:type="dxa"/>
-              <w:left w:w="100" w:type="dxa"/>
-              <w:bottom w:w="60" w:type="dxa"/>
-              <w:right w:w="100" w:type="dxa"/>
-            </w:tcMar>
-            <w:vAlign w:val="center"/>
-          </w:tcPr>
-          <w:p>
-            <w:pPr>
-              <w:jc w:val="center"/>
-            </w:pPr>
-            <w:r>
-              <w:t>xxx/xxx (xx.x) [xx.x, xx.x]</w:t>
-            </w:r>
-          </w:p>
-        </w:tc>
-        <w:tc>
-          <w:tcPr>
-            <w:tcW w:w="1700" w:type="dxa"/>
-            <w:tcBorders>
-              <w:top w:val="single" w:sz="4" w:space="0" w:color="808080"/>
-              <w:left w:val="single" w:sz="4" w:space="0" w:color="808080"/>
-              <w:bottom w:val="single" w:sz="4" w:space="0" w:color="808080"/>
-              <w:right w:val="single" w:sz="4" w:space="0" w:color="808080"/>
-            </w:tcBorders>
-            <w:tcMar>
-              <w:top w:w="60" w:type="dxa"/>
-              <w:left w:w="100" w:type="dxa"/>
-              <w:bottom w:w="60" w:type="dxa"/>
-              <w:right w:w="100" w:type="dxa"/>
-            </w:tcMar>
-            <w:vAlign w:val="center"/>
-          </w:tcPr>
-          <w:p>
-            <w:pPr>
-              <w:jc w:val="center"/>
-            </w:pPr>
-            <w:r>
-              <w:t>xxx/xxx (xx.x) [xx.x, xx.x]</w:t>
-            </w:r>
-          </w:p>
-        </w:tc>
-      </w:tr>
-      <w:tr>
-        <w:tc>
-          <w:tcPr>
-            <w:tcW w:w="3000" w:type="dxa"/>
-            <w:tcBorders>
-              <w:top w:val="single" w:sz="4" w:space="0" w:color="808080"/>
-              <w:left w:val="single" w:sz="4" w:space="0" w:color="808080"/>
-              <w:bottom w:val="single" w:sz="4" w:space="0" w:color="808080"/>
-              <w:right w:val="single" w:sz="4" w:space="0" w:color="808080"/>
-            </w:tcBorders>
-            <w:tcMar>
-              <w:top w:w="60" w:type="dxa"/>
-              <w:left w:w="100" w:type="dxa"/>
-              <w:bottom w:w="60" w:type="dxa"/>
-              <w:right w:w="100" w:type="dxa"/>
-            </w:tcMar>
-            <w:vAlign w:val="center"/>
-          </w:tcPr>
-          <w:p/>
-        </w:tc>
-        <w:tc>
-          <w:tcPr>
-            <w:tcW w:w="1100" w:type="dxa"/>
-            <w:tcBorders>
-              <w:top w:val="single" w:sz="4" w:space="0" w:color="808080"/>
-              <w:left w:val="single" w:sz="4" w:space="0" w:color="808080"/>
-              <w:bottom w:val="single" w:sz="4" w:space="0" w:color="808080"/>
-              <w:right w:val="single" w:sz="4" w:space="0" w:color="808080"/>
-            </w:tcBorders>
-            <w:tcMar>
-              <w:top w:w="60" w:type="dxa"/>
-              <w:left w:w="100" w:type="dxa"/>
-              <w:bottom w:w="60" w:type="dxa"/>
-              <w:right w:w="100" w:type="dxa"/>
-            </w:tcMar>
-            <w:vAlign w:val="center"/>
-          </w:tcPr>
-          <w:p>
-            <w:pPr>
-              <w:jc w:val="center"/>
-            </w:pPr>
-            <w:r>
-              <w:t>Wk 16</w:t>
-            </w:r>
-          </w:p>
-        </w:tc>
-        <w:tc>
-          <w:tcPr>
-            <w:tcW w:w="1700" w:type="dxa"/>
-            <w:tcBorders>
-              <w:top w:val="single" w:sz="4" w:space="0" w:color="808080"/>
-              <w:left w:val="single" w:sz="4" w:space="0" w:color="808080"/>
-              <w:bottom w:val="single" w:sz="4" w:space="0" w:color="808080"/>
-              <w:right w:val="single" w:sz="4" w:space="0" w:color="808080"/>
-            </w:tcBorders>
-            <w:tcMar>
-              <w:top w:w="60" w:type="dxa"/>
-              <w:left w:w="100" w:type="dxa"/>
-              <w:bottom w:w="60" w:type="dxa"/>
-              <w:right w:w="100" w:type="dxa"/>
-            </w:tcMar>
-            <w:vAlign w:val="center"/>
-          </w:tcPr>
-          <w:p>
-            <w:pPr>
-              <w:jc w:val="center"/>
-            </w:pPr>
-            <w:r>
-              <w:t>xxx/xxx (xx.x) [xx.x, xx.x]</w:t>
-            </w:r>
-          </w:p>
-        </w:tc>
-        <w:tc>
-          <w:tcPr>
-            <w:tcW w:w="1700" w:type="dxa"/>
-            <w:tcBorders>
-              <w:top w:val="single" w:sz="4" w:space="0" w:color="808080"/>
-              <w:left w:val="single" w:sz="4" w:space="0" w:color="808080"/>
-              <w:bottom w:val="single" w:sz="4" w:space="0" w:color="808080"/>
-              <w:right w:val="single" w:sz="4" w:space="0" w:color="808080"/>
-            </w:tcBorders>
-            <w:tcMar>
-              <w:top w:w="60" w:type="dxa"/>
-              <w:left w:w="100" w:type="dxa"/>
-              <w:bottom w:w="60" w:type="dxa"/>
-              <w:right w:w="100" w:type="dxa"/>
-            </w:tcMar>
-            <w:vAlign w:val="center"/>
-          </w:tcPr>
-          <w:p>
-            <w:pPr>
-              <w:jc w:val="center"/>
-            </w:pPr>
-            <w:r>
-              <w:t>xxx/xxx (xx.x) [xx.x, xx.x]</w:t>
-            </w:r>
-          </w:p>
-        </w:tc>
-        <w:tc>
-          <w:tcPr>
-            <w:tcW w:w="1700" w:type="dxa"/>
-            <w:tcBorders>
-              <w:top w:val="single" w:sz="4" w:space="0" w:color="808080"/>
-              <w:left w:val="single" w:sz="4" w:space="0" w:color="808080"/>
-              <w:bottom w:val="single" w:sz="4" w:space="0" w:color="808080"/>
-              <w:right w:val="single" w:sz="4" w:space="0" w:color="808080"/>
-            </w:tcBorders>
-            <w:tcMar>
-              <w:top w:w="60" w:type="dxa"/>
-              <w:left w:w="100" w:type="dxa"/>
-              <w:bottom w:w="60" w:type="dxa"/>
-              <w:right w:w="100" w:type="dxa"/>
-            </w:tcMar>
-            <w:vAlign w:val="center"/>
-          </w:tcPr>
-          <w:p>
-            <w:pPr>
-              <w:jc w:val="center"/>
-            </w:pPr>
-            <w:r>
-              <w:t>xxx/xxx (xx.x) [xx.x, xx.x]</w:t>
-            </w:r>
-          </w:p>
-        </w:tc>
-      </w:tr>
-      <w:tr>
-        <w:tc>
-          <w:tcPr>
-            <w:tcW w:w="3000" w:type="dxa"/>
-            <w:tcBorders>
-              <w:top w:val="single" w:sz="4" w:space="0" w:color="808080"/>
-              <w:left w:val="single" w:sz="4" w:space="0" w:color="808080"/>
-              <w:bottom w:val="single" w:sz="4" w:space="0" w:color="808080"/>
-              <w:right w:val="single" w:sz="4" w:space="0" w:color="808080"/>
-            </w:tcBorders>
-            <w:tcMar>
-              <w:top w:w="60" w:type="dxa"/>
-              <w:left w:w="100" w:type="dxa"/>
-              <w:bottom w:w="60" w:type="dxa"/>
-              <w:right w:w="100" w:type="dxa"/>
-            </w:tcMar>
-            <w:vAlign w:val="center"/>
-          </w:tcPr>
-          <w:p/>
-        </w:tc>
-        <w:tc>
-          <w:tcPr>
-            <w:tcW w:w="1100" w:type="dxa"/>
-            <w:tcBorders>
-              <w:top w:val="single" w:sz="4" w:space="0" w:color="808080"/>
-              <w:left w:val="single" w:sz="4" w:space="0" w:color="808080"/>
-              <w:bottom w:val="single" w:sz="4" w:space="0" w:color="808080"/>
-              <w:right w:val="single" w:sz="4" w:space="0" w:color="808080"/>
-            </w:tcBorders>
-            <w:tcMar>
-              <w:top w:w="60" w:type="dxa"/>
-              <w:left w:w="100" w:type="dxa"/>
-              <w:bottom w:w="60" w:type="dxa"/>
-              <w:right w:w="100" w:type="dxa"/>
-            </w:tcMar>
-            <w:vAlign w:val="center"/>
-          </w:tcPr>
-          <w:p>
-            <w:pPr>
-              <w:jc w:val="center"/>
-            </w:pPr>
-            <w:r>
-              <w:t>Wk 52</w:t>
-            </w:r>
-          </w:p>
-        </w:tc>
-        <w:tc>
-          <w:tcPr>
-            <w:tcW w:w="1700" w:type="dxa"/>
-            <w:tcBorders>
-              <w:top w:val="single" w:sz="4" w:space="0" w:color="808080"/>
-              <w:left w:val="single" w:sz="4" w:space="0" w:color="808080"/>
-              <w:bottom w:val="single" w:sz="4" w:space="0" w:color="808080"/>
-              <w:right w:val="single" w:sz="4" w:space="0" w:color="808080"/>
-            </w:tcBorders>
-            <w:tcMar>
-              <w:top w:w="60" w:type="dxa"/>
-              <w:left w:w="100" w:type="dxa"/>
-              <w:bottom w:w="60" w:type="dxa"/>
-              <w:right w:w="100" w:type="dxa"/>
-            </w:tcMar>
-            <w:vAlign w:val="center"/>
-          </w:tcPr>
-          <w:p>
-            <w:pPr>
-              <w:jc w:val="center"/>
-            </w:pPr>
-            <w:r>
-              <w:t>xxx/xxx (xx.x) [xx.x, xx.x]</w:t>
-            </w:r>
-          </w:p>
-        </w:tc>
-        <w:tc>
-          <w:tcPr>
-            <w:tcW w:w="1700" w:type="dxa"/>
-            <w:tcBorders>
-              <w:top w:val="single" w:sz="4" w:space="0" w:color="808080"/>
-              <w:left w:val="single" w:sz="4" w:space="0" w:color="808080"/>
-              <w:bottom w:val="single" w:sz="4" w:space="0" w:color="808080"/>
-              <w:right w:val="single" w:sz="4" w:space="0" w:color="808080"/>
-            </w:tcBorders>
-            <w:tcMar>
-              <w:top w:w="60" w:type="dxa"/>
-              <w:left w:w="100" w:type="dxa"/>
-              <w:bottom w:w="60" w:type="dxa"/>
-              <w:right w:w="100" w:type="dxa"/>
-            </w:tcMar>
-            <w:vAlign w:val="center"/>
-          </w:tcPr>
-          <w:p>
-            <w:pPr>
-              <w:jc w:val="center"/>
-            </w:pPr>
-            <w:r>
-              <w:t>xxx/xxx (xx.x) [xx.x, xx.x]</w:t>
-            </w:r>
-          </w:p>
-        </w:tc>
-        <w:tc>
-          <w:tcPr>
-            <w:tcW w:w="1700" w:type="dxa"/>
-            <w:tcBorders>
-              <w:top w:val="single" w:sz="4" w:space="0" w:color="808080"/>
-              <w:left w:val="single" w:sz="4" w:space="0" w:color="808080"/>
-              <w:bottom w:val="single" w:sz="4" w:space="0" w:color="808080"/>
-              <w:right w:val="single" w:sz="4" w:space="0" w:color="808080"/>
-            </w:tcBorders>
-            <w:tcMar>
-              <w:top w:w="60" w:type="dxa"/>
-              <w:left w:w="100" w:type="dxa"/>
-              <w:bottom w:w="60" w:type="dxa"/>
-              <w:right w:w="100" w:type="dxa"/>
-            </w:tcMar>
-            <w:vAlign w:val="center"/>
-          </w:tcPr>
-          <w:p>
-            <w:pPr>
-              <w:jc w:val="center"/>
-            </w:pPr>
-            <w:r>
-              <w:t>xxx/xxx (xx.x) [xx.x, xx.x]</w:t>
-            </w:r>
-          </w:p>
-        </w:tc>
-      </w:tr>
-      <w:tr>
-        <w:tc>
-          <w:tcPr>
-            <w:tcW w:w="3000" w:type="dxa"/>
-            <w:tcBorders>
-              <w:top w:val="single" w:sz="4" w:space="0" w:color="808080"/>
-              <w:left w:val="single" w:sz="4" w:space="0" w:color="808080"/>
-              <w:bottom w:val="single" w:sz="4" w:space="0" w:color="808080"/>
-              <w:right w:val="single" w:sz="4" w:space="0" w:color="808080"/>
-            </w:tcBorders>
-            <w:tcMar>
-              <w:top w:w="60" w:type="dxa"/>
-              <w:left w:w="100" w:type="dxa"/>
-              <w:bottom w:w="60" w:type="dxa"/>
-              <w:right w:w="100" w:type="dxa"/>
-            </w:tcMar>
-            <w:vAlign w:val="center"/>
-          </w:tcPr>
-          <w:p/>
-        </w:tc>
-        <w:tc>
-          <w:tcPr>
-            <w:tcW w:w="1100" w:type="dxa"/>
-            <w:tcBorders>
-              <w:top w:val="single" w:sz="4" w:space="0" w:color="808080"/>
-              <w:left w:val="single" w:sz="4" w:space="0" w:color="808080"/>
-              <w:bottom w:val="single" w:sz="4" w:space="0" w:color="808080"/>
-              <w:right w:val="single" w:sz="4" w:space="0" w:color="808080"/>
-            </w:tcBorders>
-            <w:tcMar>
-              <w:top w:w="60" w:type="dxa"/>
-              <w:left w:w="100" w:type="dxa"/>
-              <w:bottom w:w="60" w:type="dxa"/>
-              <w:right w:w="100" w:type="dxa"/>
-            </w:tcMar>
-            <w:vAlign w:val="center"/>
-          </w:tcPr>
-          <w:p>
-            <w:pPr>
-              <w:jc w:val="center"/>
-            </w:pPr>
-            <w:r>
-              <w:t>Wk 104</w:t>
-            </w:r>
-          </w:p>
-        </w:tc>
-        <w:tc>
-          <w:tcPr>
-            <w:tcW w:w="1700" w:type="dxa"/>
-            <w:tcBorders>
-              <w:top w:val="single" w:sz="4" w:space="0" w:color="808080"/>
-              <w:left w:val="single" w:sz="4" w:space="0" w:color="808080"/>
-              <w:bottom w:val="single" w:sz="4" w:space="0" w:color="808080"/>
-              <w:right w:val="single" w:sz="4" w:space="0" w:color="808080"/>
-            </w:tcBorders>
-            <w:tcMar>
-              <w:top w:w="60" w:type="dxa"/>
-              <w:left w:w="100" w:type="dxa"/>
-              <w:bottom w:w="60" w:type="dxa"/>
-              <w:right w:w="100" w:type="dxa"/>
-            </w:tcMar>
-            <w:vAlign w:val="center"/>
-          </w:tcPr>
-          <w:p>
-            <w:pPr>
-              <w:jc w:val="center"/>
-            </w:pPr>
-            <w:r>
-              <w:t>xxx/xxx (xx.x) [xx.x, xx.x]</w:t>
-            </w:r>
-          </w:p>
-        </w:tc>
-        <w:tc>
-          <w:tcPr>
-            <w:tcW w:w="1700" w:type="dxa"/>
-            <w:tcBorders>
-              <w:top w:val="single" w:sz="4" w:space="0" w:color="808080"/>
-              <w:left w:val="single" w:sz="4" w:space="0" w:color="808080"/>
-              <w:bottom w:val="single" w:sz="4" w:space="0" w:color="808080"/>
-              <w:right w:val="single" w:sz="4" w:space="0" w:color="808080"/>
-            </w:tcBorders>
-            <w:tcMar>
-              <w:top w:w="60" w:type="dxa"/>
-              <w:left w:w="100" w:type="dxa"/>
-              <w:bottom w:w="60" w:type="dxa"/>
-              <w:right w:w="100" w:type="dxa"/>
-            </w:tcMar>
-            <w:vAlign w:val="center"/>
-          </w:tcPr>
-          <w:p>
-            <w:pPr>
-              <w:jc w:val="center"/>
-            </w:pPr>
-            <w:r>
-              <w:t>xxx/xxx (xx.x) [xx.x, xx.x]</w:t>
-            </w:r>
-          </w:p>
-        </w:tc>
-        <w:tc>
-          <w:tcPr>
-            <w:tcW w:w="1700" w:type="dxa"/>
-            <w:tcBorders>
-              <w:top w:val="single" w:sz="4" w:space="0" w:color="808080"/>
-              <w:left w:val="single" w:sz="4" w:space="0" w:color="808080"/>
-              <w:bottom w:val="single" w:sz="4" w:space="0" w:color="808080"/>
-              <w:right w:val="single" w:sz="4" w:space="0" w:color="808080"/>
-            </w:tcBorders>
-            <w:tcMar>
-              <w:top w:w="60" w:type="dxa"/>
-              <w:left w:w="100" w:type="dxa"/>
-              <w:bottom w:w="60" w:type="dxa"/>
-              <w:right w:w="100" w:type="dxa"/>
-            </w:tcMar>
-            <w:vAlign w:val="center"/>
-          </w:tcPr>
-          <w:p>
-            <w:pPr>
-              <w:jc w:val="center"/>
-            </w:pPr>
-            <w:r>
-              <w:t>xxx/xxx (xx.x) [xx.x, xx.x]</w:t>
-            </w:r>
-          </w:p>
-        </w:tc>
-      </w:tr>
-      <w:tr>
-        <w:tc>
-          <w:tcPr>
-            <w:tcW w:w="3000" w:type="dxa"/>
-            <w:tcBorders>
-              <w:top w:val="single" w:sz="4" w:space="0" w:color="808080"/>
-              <w:left w:val="single" w:sz="4" w:space="0" w:color="808080"/>
-              <w:bottom w:val="single" w:sz="4" w:space="0" w:color="808080"/>
-              <w:right w:val="single" w:sz="4" w:space="0" w:color="808080"/>
-            </w:tcBorders>
-            <w:tcMar>
-              <w:top w:w="60" w:type="dxa"/>
-              <w:left w:w="100" w:type="dxa"/>
-              <w:bottom w:w="60" w:type="dxa"/>
-              <w:right w:w="100" w:type="dxa"/>
-            </w:tcMar>
-            <w:vAlign w:val="center"/>
-          </w:tcPr>
-          <w:p/>
-        </w:tc>
-        <w:tc>
-          <w:tcPr>
-            <w:tcW w:w="1100" w:type="dxa"/>
-            <w:tcBorders>
-              <w:top w:val="single" w:sz="4" w:space="0" w:color="808080"/>
-              <w:left w:val="single" w:sz="4" w:space="0" w:color="808080"/>
-              <w:bottom w:val="single" w:sz="4" w:space="0" w:color="808080"/>
-              <w:right w:val="single" w:sz="4" w:space="0" w:color="808080"/>
-            </w:tcBorders>
-            <w:tcMar>
-              <w:top w:w="60" w:type="dxa"/>
-              <w:left w:w="100" w:type="dxa"/>
-              <w:bottom w:w="60" w:type="dxa"/>
-              <w:right w:w="100" w:type="dxa"/>
-            </w:tcMar>
-            <w:vAlign w:val="center"/>
-          </w:tcPr>
-          <w:p>
-            <w:pPr>
-              <w:jc w:val="center"/>
-            </w:pPr>
-            <w:r>
-              <w:t>Wk 140</w:t>
-            </w:r>
-          </w:p>
-        </w:tc>
-        <w:tc>
-          <w:tcPr>
-            <w:tcW w:w="1700" w:type="dxa"/>
-            <w:tcBorders>
-              <w:top w:val="single" w:sz="4" w:space="0" w:color="808080"/>
-              <w:left w:val="single" w:sz="4" w:space="0" w:color="808080"/>
-              <w:bottom w:val="single" w:sz="4" w:space="0" w:color="808080"/>
-              <w:right w:val="single" w:sz="4" w:space="0" w:color="808080"/>
-            </w:tcBorders>
-            <w:tcMar>
-              <w:top w:w="60" w:type="dxa"/>
-              <w:left w:w="100" w:type="dxa"/>
-              <w:bottom w:w="60" w:type="dxa"/>
-              <w:right w:w="100" w:type="dxa"/>
-            </w:tcMar>
-            <w:vAlign w:val="center"/>
-          </w:tcPr>
-          <w:p>
-            <w:pPr>
-              <w:jc w:val="center"/>
-            </w:pPr>
-            <w:r>
-              <w:t>xxx/xxx (xx.x) [xx.x, xx.x]</w:t>
-            </w:r>
-          </w:p>
-        </w:tc>
-        <w:tc>
-          <w:tcPr>
-            <w:tcW w:w="1700" w:type="dxa"/>
-            <w:tcBorders>
-              <w:top w:val="single" w:sz="4" w:space="0" w:color="808080"/>
-              <w:left w:val="single" w:sz="4" w:space="0" w:color="808080"/>
-              <w:bottom w:val="single" w:sz="4" w:space="0" w:color="808080"/>
-              <w:right w:val="single" w:sz="4" w:space="0" w:color="808080"/>
-            </w:tcBorders>
-            <w:tcMar>
-              <w:top w:w="60" w:type="dxa"/>
-              <w:left w:w="100" w:type="dxa"/>
-              <w:bottom w:w="60" w:type="dxa"/>
-              <w:right w:w="100" w:type="dxa"/>
-            </w:tcMar>
-            <w:vAlign w:val="center"/>
-          </w:tcPr>
-          <w:p>
-            <w:pPr>
-              <w:jc w:val="center"/>
-            </w:pPr>
-            <w:r>
-              <w:t>xxx/xxx (xx.x) [xx.x, xx.x]</w:t>
-            </w:r>
-          </w:p>
-        </w:tc>
-        <w:tc>
-          <w:tcPr>
-            <w:tcW w:w="1700" w:type="dxa"/>
-            <w:tcBorders>
-              <w:top w:val="single" w:sz="4" w:space="0" w:color="808080"/>
-              <w:left w:val="single" w:sz="4" w:space="0" w:color="808080"/>
-              <w:bottom w:val="single" w:sz="4" w:space="0" w:color="808080"/>
-              <w:right w:val="single" w:sz="4" w:space="0" w:color="808080"/>
-            </w:tcBorders>
-            <w:tcMar>
-              <w:top w:w="60" w:type="dxa"/>
-              <w:left w:w="100" w:type="dxa"/>
-              <w:bottom w:w="60" w:type="dxa"/>
-              <w:right w:w="100" w:type="dxa"/>
-            </w:tcMar>
-            <w:vAlign w:val="center"/>
-          </w:tcPr>
-          <w:p>
-            <w:pPr>
-              <w:jc w:val="center"/>
-            </w:pPr>
-            <w:r>
-              <w:t>xxx/xxx (xx.x) [xx.x, xx.x]</w:t>
-            </w:r>
-          </w:p>
-        </w:tc>
-      </w:tr>
-      <w:tr>
-        <w:trPr>
-          <w:gridAfter w:val="4"/>
-          <w:wAfter w:w="6200" w:type="dxa"/>
-        </w:trPr>
-        <w:tc>
-          <w:tcPr>
-            <w:tcW w:w="9200" w:type="dxa"/>
-            <w:tcBorders>
-              <w:top w:val="single" w:sz="4" w:space="0" w:color="808080"/>
-              <w:left w:val="single" w:sz="4" w:space="0" w:color="808080"/>
-              <w:bottom w:val="single" w:sz="4" w:space="0" w:color="808080"/>
-              <w:right w:val="single" w:sz="4" w:space="0" w:color="808080"/>
-            </w:tcBorders>
-            <w:shd w:val="clear" w:color="auto" w:fill="D9E2F3"/>
-            <w:tcMar>
-              <w:top w:w="60" w:type="dxa"/>
-              <w:left w:w="100" w:type="dxa"/>
-              <w:bottom w:w="60" w:type="dxa"/>
-              <w:right w:w="100" w:type="dxa"/>
-            </w:tcMar>
-            <w:vAlign w:val="center"/>
-          </w:tcPr>
-          <w:p>
-            <w:r>
-              <w:t xml:space="preserve">EASI ≤ 7 (AHEAD moderate target for skin clearance)  </w:t>
-            </w:r>
-          </w:p>
-        </w:tc>
-      </w:tr>
-      <w:tr>
-        <w:tc>
-          <w:tcPr>
-            <w:tcW w:w="3000" w:type="dxa"/>
-            <w:tcBorders>
-              <w:top w:val="single" w:sz="4" w:space="0" w:color="808080"/>
-              <w:left w:val="single" w:sz="4" w:space="0" w:color="808080"/>
-              <w:bottom w:val="single" w:sz="4" w:space="0" w:color="808080"/>
-              <w:right w:val="single" w:sz="4" w:space="0" w:color="808080"/>
-            </w:tcBorders>
-            <w:tcMar>
-              <w:top w:w="60" w:type="dxa"/>
-              <w:left w:w="100" w:type="dxa"/>
-              <w:bottom w:w="60" w:type="dxa"/>
-              <w:right w:w="100" w:type="dxa"/>
-            </w:tcMar>
-            <w:vAlign w:val="center"/>
-          </w:tcPr>
-          <w:p>
-            <w:r>
-              <w:t>EASI ≤ 7 (AHEAD moderate target for skin clearance)</w:t>
-            </w:r>
-          </w:p>
-        </w:tc>
-        <w:tc>
-          <w:tcPr>
-            <w:tcW w:w="1100" w:type="dxa"/>
-            <w:tcBorders>
-              <w:top w:val="single" w:sz="4" w:space="0" w:color="808080"/>
-              <w:left w:val="single" w:sz="4" w:space="0" w:color="808080"/>
-              <w:bottom w:val="single" w:sz="4" w:space="0" w:color="808080"/>
-              <w:right w:val="single" w:sz="4" w:space="0" w:color="808080"/>
-            </w:tcBorders>
-            <w:tcMar>
-              <w:top w:w="60" w:type="dxa"/>
-              <w:left w:w="100" w:type="dxa"/>
-              <w:bottom w:w="60" w:type="dxa"/>
-              <w:right w:w="100" w:type="dxa"/>
-            </w:tcMar>
-            <w:vAlign w:val="center"/>
-          </w:tcPr>
-          <w:p>
-            <w:pPr>
-              <w:jc w:val="center"/>
-            </w:pPr>
-            <w:r>
-              <w:t>Wk 4</w:t>
-            </w:r>
-          </w:p>
-        </w:tc>
-        <w:tc>
-          <w:tcPr>
-            <w:tcW w:w="1700" w:type="dxa"/>
-            <w:tcBorders>
-              <w:top w:val="single" w:sz="4" w:space="0" w:color="808080"/>
-              <w:left w:val="single" w:sz="4" w:space="0" w:color="808080"/>
-              <w:bottom w:val="single" w:sz="4" w:space="0" w:color="808080"/>
-              <w:right w:val="single" w:sz="4" w:space="0" w:color="808080"/>
-            </w:tcBorders>
-            <w:tcMar>
-              <w:top w:w="60" w:type="dxa"/>
-              <w:left w:w="100" w:type="dxa"/>
-              <w:bottom w:w="60" w:type="dxa"/>
-              <w:right w:w="100" w:type="dxa"/>
-            </w:tcMar>
-            <w:vAlign w:val="center"/>
-          </w:tcPr>
-          <w:p>
-            <w:pPr>
-              <w:jc w:val="center"/>
-            </w:pPr>
-            <w:r>
-              <w:t>xxx/xxx (xx.x) [xx.x, xx.x]</w:t>
-            </w:r>
-          </w:p>
-        </w:tc>
-        <w:tc>
-          <w:tcPr>
-            <w:tcW w:w="1700" w:type="dxa"/>
-            <w:tcBorders>
-              <w:top w:val="single" w:sz="4" w:space="0" w:color="808080"/>
-              <w:left w:val="single" w:sz="4" w:space="0" w:color="808080"/>
-              <w:bottom w:val="single" w:sz="4" w:space="0" w:color="808080"/>
-              <w:right w:val="single" w:sz="4" w:space="0" w:color="808080"/>
-            </w:tcBorders>
-            <w:tcMar>
-              <w:top w:w="60" w:type="dxa"/>
-              <w:left w:w="100" w:type="dxa"/>
-              <w:bottom w:w="60" w:type="dxa"/>
-              <w:right w:w="100" w:type="dxa"/>
-            </w:tcMar>
-            <w:vAlign w:val="center"/>
-          </w:tcPr>
-          <w:p>
-            <w:pPr>
-              <w:jc w:val="center"/>
-            </w:pPr>
-            <w:r>
-              <w:t>xxx/xxx (xx.x) [xx.x, xx.x]</w:t>
-            </w:r>
-          </w:p>
-        </w:tc>
-        <w:tc>
-          <w:tcPr>
-            <w:tcW w:w="1700" w:type="dxa"/>
-            <w:tcBorders>
-              <w:top w:val="single" w:sz="4" w:space="0" w:color="808080"/>
-              <w:left w:val="single" w:sz="4" w:space="0" w:color="808080"/>
-              <w:bottom w:val="single" w:sz="4" w:space="0" w:color="808080"/>
-              <w:right w:val="single" w:sz="4" w:space="0" w:color="808080"/>
-            </w:tcBorders>
-            <w:tcMar>
-              <w:top w:w="60" w:type="dxa"/>
-              <w:left w:w="100" w:type="dxa"/>
-              <w:bottom w:w="60" w:type="dxa"/>
-              <w:right w:w="100" w:type="dxa"/>
-            </w:tcMar>
-            <w:vAlign w:val="center"/>
-          </w:tcPr>
-          <w:p>
-            <w:pPr>
-              <w:jc w:val="center"/>
-            </w:pPr>
-            <w:r>
-              <w:t>xxx/xxx (xx.x) [xx.x, xx.x]</w:t>
-            </w:r>
-          </w:p>
-        </w:tc>
-      </w:tr>
-      <w:tr>
-        <w:tc>
-          <w:tcPr>
-            <w:tcW w:w="3000" w:type="dxa"/>
-            <w:tcBorders>
-              <w:top w:val="single" w:sz="4" w:space="0" w:color="808080"/>
-              <w:left w:val="single" w:sz="4" w:space="0" w:color="808080"/>
-              <w:bottom w:val="single" w:sz="4" w:space="0" w:color="808080"/>
-              <w:right w:val="single" w:sz="4" w:space="0" w:color="808080"/>
-            </w:tcBorders>
-            <w:tcMar>
-              <w:top w:w="60" w:type="dxa"/>
-              <w:left w:w="100" w:type="dxa"/>
-              <w:bottom w:w="60" w:type="dxa"/>
-              <w:right w:w="100" w:type="dxa"/>
-            </w:tcMar>
-            <w:vAlign w:val="center"/>
-          </w:tcPr>
-          <w:p/>
-        </w:tc>
-        <w:tc>
-          <w:tcPr>
-            <w:tcW w:w="1100" w:type="dxa"/>
-            <w:tcBorders>
-              <w:top w:val="single" w:sz="4" w:space="0" w:color="808080"/>
-              <w:left w:val="single" w:sz="4" w:space="0" w:color="808080"/>
-              <w:bottom w:val="single" w:sz="4" w:space="0" w:color="808080"/>
-              <w:right w:val="single" w:sz="4" w:space="0" w:color="808080"/>
-            </w:tcBorders>
-            <w:tcMar>
-              <w:top w:w="60" w:type="dxa"/>
-              <w:left w:w="100" w:type="dxa"/>
-              <w:bottom w:w="60" w:type="dxa"/>
-              <w:right w:w="100" w:type="dxa"/>
-            </w:tcMar>
-            <w:vAlign w:val="center"/>
-          </w:tcPr>
-          <w:p>
-            <w:pPr>
-              <w:jc w:val="center"/>
-            </w:pPr>
-            <w:r>
-              <w:t>Wk 16</w:t>
-            </w:r>
-          </w:p>
-        </w:tc>
-        <w:tc>
-          <w:tcPr>
-            <w:tcW w:w="1700" w:type="dxa"/>
-            <w:tcBorders>
-              <w:top w:val="single" w:sz="4" w:space="0" w:color="808080"/>
-              <w:left w:val="single" w:sz="4" w:space="0" w:color="808080"/>
-              <w:bottom w:val="single" w:sz="4" w:space="0" w:color="808080"/>
-              <w:right w:val="single" w:sz="4" w:space="0" w:color="808080"/>
-            </w:tcBorders>
-            <w:tcMar>
-              <w:top w:w="60" w:type="dxa"/>
-              <w:left w:w="100" w:type="dxa"/>
-              <w:bottom w:w="60" w:type="dxa"/>
-              <w:right w:w="100" w:type="dxa"/>
-            </w:tcMar>
-            <w:vAlign w:val="center"/>
-          </w:tcPr>
-          <w:p>
-            <w:pPr>
-              <w:jc w:val="center"/>
-            </w:pPr>
-            <w:r>
-              <w:t>xxx/xxx (xx.x) [xx.x, xx.x]</w:t>
-            </w:r>
-          </w:p>
-        </w:tc>
-        <w:tc>
-          <w:tcPr>
-            <w:tcW w:w="1700" w:type="dxa"/>
-            <w:tcBorders>
-              <w:top w:val="single" w:sz="4" w:space="0" w:color="808080"/>
-              <w:left w:val="single" w:sz="4" w:space="0" w:color="808080"/>
-              <w:bottom w:val="single" w:sz="4" w:space="0" w:color="808080"/>
-              <w:right w:val="single" w:sz="4" w:space="0" w:color="808080"/>
-            </w:tcBorders>
-            <w:tcMar>
-              <w:top w:w="60" w:type="dxa"/>
-              <w:left w:w="100" w:type="dxa"/>
-              <w:bottom w:w="60" w:type="dxa"/>
-              <w:right w:w="100" w:type="dxa"/>
-            </w:tcMar>
-            <w:vAlign w:val="center"/>
-          </w:tcPr>
-          <w:p>
-            <w:pPr>
-              <w:jc w:val="center"/>
-            </w:pPr>
-            <w:r>
-              <w:t>xxx/xxx (xx.x) [xx.x, xx.x]</w:t>
-            </w:r>
-          </w:p>
-        </w:tc>
-        <w:tc>
-          <w:tcPr>
-            <w:tcW w:w="1700" w:type="dxa"/>
-            <w:tcBorders>
-              <w:top w:val="single" w:sz="4" w:space="0" w:color="808080"/>
-              <w:left w:val="single" w:sz="4" w:space="0" w:color="808080"/>
-              <w:bottom w:val="single" w:sz="4" w:space="0" w:color="808080"/>
-              <w:right w:val="single" w:sz="4" w:space="0" w:color="808080"/>
-            </w:tcBorders>
-            <w:tcMar>
-              <w:top w:w="60" w:type="dxa"/>
-              <w:left w:w="100" w:type="dxa"/>
-              <w:bottom w:w="60" w:type="dxa"/>
-              <w:right w:w="100" w:type="dxa"/>
-            </w:tcMar>
-            <w:vAlign w:val="center"/>
-          </w:tcPr>
-          <w:p>
-            <w:pPr>
-              <w:jc w:val="center"/>
-            </w:pPr>
-            <w:r>
-              <w:t>xxx/xxx (xx.x) [xx.x, xx.x]</w:t>
-            </w:r>
-          </w:p>
-        </w:tc>
-      </w:tr>
-      <w:tr>
-        <w:tc>
-          <w:tcPr>
-            <w:tcW w:w="3000" w:type="dxa"/>
-            <w:tcBorders>
-              <w:top w:val="single" w:sz="4" w:space="0" w:color="808080"/>
-              <w:left w:val="single" w:sz="4" w:space="0" w:color="808080"/>
-              <w:bottom w:val="single" w:sz="4" w:space="0" w:color="808080"/>
-              <w:right w:val="single" w:sz="4" w:space="0" w:color="808080"/>
-            </w:tcBorders>
-            <w:tcMar>
-              <w:top w:w="60" w:type="dxa"/>
-              <w:left w:w="100" w:type="dxa"/>
-              <w:bottom w:w="60" w:type="dxa"/>
-              <w:right w:w="100" w:type="dxa"/>
-            </w:tcMar>
-            <w:vAlign w:val="center"/>
-          </w:tcPr>
-          <w:p/>
-        </w:tc>
-        <w:tc>
-          <w:tcPr>
-            <w:tcW w:w="1100" w:type="dxa"/>
-            <w:tcBorders>
-              <w:top w:val="single" w:sz="4" w:space="0" w:color="808080"/>
-              <w:left w:val="single" w:sz="4" w:space="0" w:color="808080"/>
-              <w:bottom w:val="single" w:sz="4" w:space="0" w:color="808080"/>
-              <w:right w:val="single" w:sz="4" w:space="0" w:color="808080"/>
-            </w:tcBorders>
-            <w:tcMar>
-              <w:top w:w="60" w:type="dxa"/>
-              <w:left w:w="100" w:type="dxa"/>
-              <w:bottom w:w="60" w:type="dxa"/>
-              <w:right w:w="100" w:type="dxa"/>
-            </w:tcMar>
-            <w:vAlign w:val="center"/>
-          </w:tcPr>
-          <w:p>
-            <w:pPr>
-              <w:jc w:val="center"/>
-            </w:pPr>
-            <w:r>
-              <w:t>Wk 52</w:t>
-            </w:r>
-          </w:p>
-        </w:tc>
-        <w:tc>
-          <w:tcPr>
-            <w:tcW w:w="1700" w:type="dxa"/>
-            <w:tcBorders>
-              <w:top w:val="single" w:sz="4" w:space="0" w:color="808080"/>
-              <w:left w:val="single" w:sz="4" w:space="0" w:color="808080"/>
-              <w:bottom w:val="single" w:sz="4" w:space="0" w:color="808080"/>
-              <w:right w:val="single" w:sz="4" w:space="0" w:color="808080"/>
-            </w:tcBorders>
-            <w:tcMar>
-              <w:top w:w="60" w:type="dxa"/>
-              <w:left w:w="100" w:type="dxa"/>
-              <w:bottom w:w="60" w:type="dxa"/>
-              <w:right w:w="100" w:type="dxa"/>
-            </w:tcMar>
-            <w:vAlign w:val="center"/>
-          </w:tcPr>
-          <w:p>
-            <w:pPr>
-              <w:jc w:val="center"/>
-            </w:pPr>
-            <w:r>
-              <w:t>xxx/xxx (xx.x) [xx.x, xx.x]</w:t>
-            </w:r>
-          </w:p>
-        </w:tc>
-        <w:tc>
-          <w:tcPr>
-            <w:tcW w:w="1700" w:type="dxa"/>
-            <w:tcBorders>
-              <w:top w:val="single" w:sz="4" w:space="0" w:color="808080"/>
-              <w:left w:val="single" w:sz="4" w:space="0" w:color="808080"/>
-              <w:bottom w:val="single" w:sz="4" w:space="0" w:color="808080"/>
-              <w:right w:val="single" w:sz="4" w:space="0" w:color="808080"/>
-            </w:tcBorders>
-            <w:tcMar>
-              <w:top w:w="60" w:type="dxa"/>
-              <w:left w:w="100" w:type="dxa"/>
-              <w:bottom w:w="60" w:type="dxa"/>
-              <w:right w:w="100" w:type="dxa"/>
-            </w:tcMar>
-            <w:vAlign w:val="center"/>
-          </w:tcPr>
-          <w:p>
-            <w:pPr>
-              <w:jc w:val="center"/>
-            </w:pPr>
-            <w:r>
-              <w:t>xxx/xxx (xx.x) [xx.x, xx.x]</w:t>
-            </w:r>
-          </w:p>
-        </w:tc>
-        <w:tc>
-          <w:tcPr>
-            <w:tcW w:w="1700" w:type="dxa"/>
-            <w:tcBorders>
-              <w:top w:val="single" w:sz="4" w:space="0" w:color="808080"/>
-              <w:left w:val="single" w:sz="4" w:space="0" w:color="808080"/>
-              <w:bottom w:val="single" w:sz="4" w:space="0" w:color="808080"/>
-              <w:right w:val="single" w:sz="4" w:space="0" w:color="808080"/>
-            </w:tcBorders>
-            <w:tcMar>
-              <w:top w:w="60" w:type="dxa"/>
-              <w:left w:w="100" w:type="dxa"/>
-              <w:bottom w:w="60" w:type="dxa"/>
-              <w:right w:w="100" w:type="dxa"/>
-            </w:tcMar>
-            <w:vAlign w:val="center"/>
-          </w:tcPr>
-          <w:p>
-            <w:pPr>
-              <w:jc w:val="center"/>
-            </w:pPr>
-            <w:r>
-              <w:t>xxx/xxx (xx.x) [xx.x, xx.x]</w:t>
-            </w:r>
-          </w:p>
-        </w:tc>
-      </w:tr>
-      <w:tr>
-        <w:tc>
-          <w:tcPr>
-            <w:tcW w:w="3000" w:type="dxa"/>
-            <w:tcBorders>
-              <w:top w:val="single" w:sz="4" w:space="0" w:color="808080"/>
-              <w:left w:val="single" w:sz="4" w:space="0" w:color="808080"/>
-              <w:bottom w:val="single" w:sz="4" w:space="0" w:color="808080"/>
-              <w:right w:val="single" w:sz="4" w:space="0" w:color="808080"/>
-            </w:tcBorders>
-            <w:tcMar>
-              <w:top w:w="60" w:type="dxa"/>
-              <w:left w:w="100" w:type="dxa"/>
-              <w:bottom w:w="60" w:type="dxa"/>
-              <w:right w:w="100" w:type="dxa"/>
-            </w:tcMar>
-            <w:vAlign w:val="center"/>
-          </w:tcPr>
-          <w:p/>
-        </w:tc>
-        <w:tc>
-          <w:tcPr>
-            <w:tcW w:w="1100" w:type="dxa"/>
-            <w:tcBorders>
-              <w:top w:val="single" w:sz="4" w:space="0" w:color="808080"/>
-              <w:left w:val="single" w:sz="4" w:space="0" w:color="808080"/>
-              <w:bottom w:val="single" w:sz="4" w:space="0" w:color="808080"/>
-              <w:right w:val="single" w:sz="4" w:space="0" w:color="808080"/>
-            </w:tcBorders>
-            <w:tcMar>
-              <w:top w:w="60" w:type="dxa"/>
-              <w:left w:w="100" w:type="dxa"/>
-              <w:bottom w:w="60" w:type="dxa"/>
-              <w:right w:w="100" w:type="dxa"/>
-            </w:tcMar>
-            <w:vAlign w:val="center"/>
-          </w:tcPr>
-          <w:p>
-            <w:pPr>
-              <w:jc w:val="center"/>
-            </w:pPr>
-            <w:r>
-              <w:t>Wk 104</w:t>
-            </w:r>
-          </w:p>
-        </w:tc>
-        <w:tc>
-          <w:tcPr>
-            <w:tcW w:w="1700" w:type="dxa"/>
-            <w:tcBorders>
-              <w:top w:val="single" w:sz="4" w:space="0" w:color="808080"/>
-              <w:left w:val="single" w:sz="4" w:space="0" w:color="808080"/>
-              <w:bottom w:val="single" w:sz="4" w:space="0" w:color="808080"/>
-              <w:right w:val="single" w:sz="4" w:space="0" w:color="808080"/>
-            </w:tcBorders>
-            <w:tcMar>
-              <w:top w:w="60" w:type="dxa"/>
-              <w:left w:w="100" w:type="dxa"/>
-              <w:bottom w:w="60" w:type="dxa"/>
-              <w:right w:w="100" w:type="dxa"/>
-            </w:tcMar>
-            <w:vAlign w:val="center"/>
-          </w:tcPr>
-          <w:p>
-            <w:pPr>
-              <w:jc w:val="center"/>
-            </w:pPr>
-            <w:r>
-              <w:t>xxx/xxx (xx.x) [xx.x, xx.x]</w:t>
-            </w:r>
-          </w:p>
-        </w:tc>
-        <w:tc>
-          <w:tcPr>
-            <w:tcW w:w="1700" w:type="dxa"/>
-            <w:tcBorders>
-              <w:top w:val="single" w:sz="4" w:space="0" w:color="808080"/>
-              <w:left w:val="single" w:sz="4" w:space="0" w:color="808080"/>
-              <w:bottom w:val="single" w:sz="4" w:space="0" w:color="808080"/>
-              <w:right w:val="single" w:sz="4" w:space="0" w:color="808080"/>
-            </w:tcBorders>
-            <w:tcMar>
-              <w:top w:w="60" w:type="dxa"/>
-              <w:left w:w="100" w:type="dxa"/>
-              <w:bottom w:w="60" w:type="dxa"/>
-              <w:right w:w="100" w:type="dxa"/>
-            </w:tcMar>
-            <w:vAlign w:val="center"/>
-          </w:tcPr>
-          <w:p>
-            <w:pPr>
-              <w:jc w:val="center"/>
-            </w:pPr>
-            <w:r>
-              <w:t>xxx/xxx (xx.x) [xx.x, xx.x]</w:t>
-            </w:r>
-          </w:p>
-        </w:tc>
-        <w:tc>
-          <w:tcPr>
-            <w:tcW w:w="1700" w:type="dxa"/>
-            <w:tcBorders>
-              <w:top w:val="single" w:sz="4" w:space="0" w:color="808080"/>
-              <w:left w:val="single" w:sz="4" w:space="0" w:color="808080"/>
-              <w:bottom w:val="single" w:sz="4" w:space="0" w:color="808080"/>
-              <w:right w:val="single" w:sz="4" w:space="0" w:color="808080"/>
-            </w:tcBorders>
-            <w:tcMar>
-              <w:top w:w="60" w:type="dxa"/>
-              <w:left w:w="100" w:type="dxa"/>
-              <w:bottom w:w="60" w:type="dxa"/>
-              <w:right w:w="100" w:type="dxa"/>
-            </w:tcMar>
-            <w:vAlign w:val="center"/>
-          </w:tcPr>
-          <w:p>
-            <w:pPr>
-              <w:jc w:val="center"/>
-            </w:pPr>
-            <w:r>
-              <w:t>xxx/xxx (xx.x) [xx.x, xx.x]</w:t>
-            </w:r>
-          </w:p>
-        </w:tc>
-      </w:tr>
-      <w:tr>
-        <w:tc>
-          <w:tcPr>
-            <w:tcW w:w="3000" w:type="dxa"/>
-            <w:tcBorders>
-              <w:top w:val="single" w:sz="4" w:space="0" w:color="808080"/>
-              <w:left w:val="single" w:sz="4" w:space="0" w:color="808080"/>
-              <w:bottom w:val="single" w:sz="4" w:space="0" w:color="808080"/>
-              <w:right w:val="single" w:sz="4" w:space="0" w:color="808080"/>
-            </w:tcBorders>
-            <w:tcMar>
-              <w:top w:w="60" w:type="dxa"/>
-              <w:left w:w="100" w:type="dxa"/>
-              <w:bottom w:w="60" w:type="dxa"/>
-              <w:right w:w="100" w:type="dxa"/>
-            </w:tcMar>
-            <w:vAlign w:val="center"/>
-          </w:tcPr>
-          <w:p/>
-        </w:tc>
-        <w:tc>
-          <w:tcPr>
-            <w:tcW w:w="1100" w:type="dxa"/>
-            <w:tcBorders>
-              <w:top w:val="single" w:sz="4" w:space="0" w:color="808080"/>
-              <w:left w:val="single" w:sz="4" w:space="0" w:color="808080"/>
-              <w:bottom w:val="single" w:sz="4" w:space="0" w:color="808080"/>
-              <w:right w:val="single" w:sz="4" w:space="0" w:color="808080"/>
-            </w:tcBorders>
-            <w:tcMar>
-              <w:top w:w="60" w:type="dxa"/>
-              <w:left w:w="100" w:type="dxa"/>
-              <w:bottom w:w="60" w:type="dxa"/>
-              <w:right w:w="100" w:type="dxa"/>
-            </w:tcMar>
-            <w:vAlign w:val="center"/>
-          </w:tcPr>
-          <w:p>
-            <w:pPr>
-              <w:jc w:val="center"/>
-            </w:pPr>
-            <w:r>
-              <w:t>Wk 140</w:t>
-            </w:r>
-          </w:p>
-        </w:tc>
-        <w:tc>
-          <w:tcPr>
-            <w:tcW w:w="1700" w:type="dxa"/>
-            <w:tcBorders>
-              <w:top w:val="single" w:sz="4" w:space="0" w:color="808080"/>
-              <w:left w:val="single" w:sz="4" w:space="0" w:color="808080"/>
-              <w:bottom w:val="single" w:sz="4" w:space="0" w:color="808080"/>
-              <w:right w:val="single" w:sz="4" w:space="0" w:color="808080"/>
-            </w:tcBorders>
-            <w:tcMar>
-              <w:top w:w="60" w:type="dxa"/>
-              <w:left w:w="100" w:type="dxa"/>
-              <w:bottom w:w="60" w:type="dxa"/>
-              <w:right w:w="100" w:type="dxa"/>
-            </w:tcMar>
-            <w:vAlign w:val="center"/>
-          </w:tcPr>
-          <w:p>
-            <w:pPr>
-              <w:jc w:val="center"/>
-            </w:pPr>
-            <w:r>
-              <w:t>xxx/xxx (xx.x) [xx.x, xx.x]</w:t>
-            </w:r>
-          </w:p>
-        </w:tc>
-        <w:tc>
-          <w:tcPr>
-            <w:tcW w:w="1700" w:type="dxa"/>
-            <w:tcBorders>
-              <w:top w:val="single" w:sz="4" w:space="0" w:color="808080"/>
-              <w:left w:val="single" w:sz="4" w:space="0" w:color="808080"/>
-              <w:bottom w:val="single" w:sz="4" w:space="0" w:color="808080"/>
-              <w:right w:val="single" w:sz="4" w:space="0" w:color="808080"/>
-            </w:tcBorders>
-            <w:tcMar>
-              <w:top w:w="60" w:type="dxa"/>
-              <w:left w:w="100" w:type="dxa"/>
-              <w:bottom w:w="60" w:type="dxa"/>
-              <w:right w:w="100" w:type="dxa"/>
-            </w:tcMar>
-            <w:vAlign w:val="center"/>
-          </w:tcPr>
-          <w:p>
-            <w:pPr>
-              <w:jc w:val="center"/>
-            </w:pPr>
-            <w:r>
-              <w:t>xxx/xxx (xx.x) [xx.x, xx.x]</w:t>
-            </w:r>
-          </w:p>
-        </w:tc>
-        <w:tc>
-          <w:tcPr>
-            <w:tcW w:w="1700" w:type="dxa"/>
-            <w:tcBorders>
-              <w:top w:val="single" w:sz="4" w:space="0" w:color="808080"/>
-              <w:left w:val="single" w:sz="4" w:space="0" w:color="808080"/>
-              <w:bottom w:val="single" w:sz="4" w:space="0" w:color="808080"/>
-              <w:right w:val="single" w:sz="4" w:space="0" w:color="808080"/>
-            </w:tcBorders>
-            <w:tcMar>
-              <w:top w:w="60" w:type="dxa"/>
-              <w:left w:w="100" w:type="dxa"/>
-              <w:bottom w:w="60" w:type="dxa"/>
-              <w:right w:w="100" w:type="dxa"/>
-            </w:tcMar>
-            <w:vAlign w:val="center"/>
-          </w:tcPr>
-          <w:p>
-            <w:pPr>
-              <w:jc w:val="center"/>
-            </w:pPr>
-            <w:r>
-              <w:t>xxx/xxx (xx.x) [xx.x, xx.x]</w:t>
-            </w:r>
-          </w:p>
-        </w:tc>
-      </w:tr>
-    </w:tbl>
-    <w:p>
-      <w:pPr>
-        <w:spacing w:before="100"/>
-      </w:pPr>
-      <w:r>
-        <w:rPr>
-          <w:i/>
-          <w:iCs/>
-          <w:sz w:val="16"/>
-          <w:szCs w:val="16"/>
-        </w:rPr>
-        <w:t>N' = number of subjects with non-missing EASI at the visit (denominator). 95% CIs computed using normal approximation to the binomial.</w:t>
-      </w:r>
-    </w:p>
-    <w:p>
-      <w:pPr>
-        <w:spacing w:before="100"/>
-      </w:pPr>
-      <w:r>
-        <w:rPr>
-          <w:i/>
-          <w:iCs/>
-          <w:sz w:val="16"/>
-          <w:szCs w:val="16"/>
-        </w:rPr>
-        <w:t>Observed cases analysis: subjects with missing EASI at the visit are excluded from both numerator and denominator.</w:t>
-      </w:r>
-    </w:p>
-    <w:p>
-      <w:pPr>
-        <w:spacing w:before="60"/>
-      </w:pPr>
-      <w:r>
-        <w:rPr>
-          <w:i/>
-          <w:iCs/>
-          <w:color w:val="808080"/>
-          <w:sz w:val="14"/>
-          <w:szCs w:val="14"/>
-        </w:rPr>
-        <w:t>Source: ADEFF (PARAMCD in 'EASI75','EASI90','EASI100','EASILE3','EASILE7').</w:t>
       </w:r>
     </w:p>
     <w:p>

</xml_diff>